<commit_message>
Actualización formato font, descuadres de texto y una imagen del dashboard.
</commit_message>
<xml_diff>
--- a/V2.Informe Data Analisis.docx
+++ b/V2.Informe Data Analisis.docx
@@ -232,27 +232,6 @@
             <w:pStyle w:val="TtuloTDC"/>
             <w:rPr>
               <w:rFonts w:ascii="Arial" w:hAnsi="Arial" w:cs="Arial"/>
-              <w:sz w:val="16"/>
-              <w:szCs w:val="16"/>
-            </w:rPr>
-          </w:pPr>
-          <w:r>
-            <w:rPr>
-              <w:rFonts w:ascii="Arial" w:hAnsi="Arial" w:cs="Arial"/>
-              <w:sz w:val="16"/>
-              <w:szCs w:val="16"/>
-            </w:rPr>
-            <w:t>Tabla de contenido</w:t>
-          </w:r>
-        </w:p>
-        <w:p>
-          <w:pPr>
-            <w:pStyle w:val="TDC1"/>
-            <w:tabs>
-              <w:tab w:val="right" w:leader="dot" w:pos="8494"/>
-            </w:tabs>
-            <w:rPr>
-              <w:noProof/>
               <w:sz w:val="13"/>
               <w:szCs w:val="13"/>
             </w:rPr>
@@ -263,94 +242,67 @@
               <w:sz w:val="13"/>
               <w:szCs w:val="13"/>
             </w:rPr>
+            <w:t>Tabla de contenido</w:t>
+          </w:r>
+        </w:p>
+        <w:p>
+          <w:pPr>
+            <w:pStyle w:val="TDC1"/>
+          </w:pPr>
+          <w:r>
             <w:fldChar w:fldCharType="begin"/>
           </w:r>
           <w:r>
-            <w:rPr>
-              <w:rFonts w:ascii="Arial" w:hAnsi="Arial" w:cs="Arial"/>
-              <w:sz w:val="13"/>
-              <w:szCs w:val="13"/>
-            </w:rPr>
             <w:instrText xml:space="preserve"> TOC \o "1-3" \h \z \u </w:instrText>
           </w:r>
           <w:r>
-            <w:rPr>
-              <w:rFonts w:ascii="Arial" w:hAnsi="Arial" w:cs="Arial"/>
-              <w:sz w:val="13"/>
-              <w:szCs w:val="13"/>
-            </w:rPr>
             <w:fldChar w:fldCharType="separate"/>
           </w:r>
-          <w:hyperlink w:anchor="_Toc232507644" w:history="1">
+          <w:hyperlink w:anchor="_Toc233195708" w:history="1">
             <w:r>
               <w:rPr>
                 <w:rStyle w:val="Hipervnculo"/>
-                <w:rFonts w:ascii="Arial" w:hAnsi="Arial" w:cs="Arial"/>
-                <w:noProof/>
-                <w:sz w:val="13"/>
-                <w:szCs w:val="13"/>
               </w:rPr>
               <w:t>1. Resumen ejecutivo</w:t>
             </w:r>
             <w:r>
               <w:rPr>
-                <w:noProof/>
-                <w:webHidden/>
-                <w:sz w:val="13"/>
-                <w:szCs w:val="13"/>
+                <w:webHidden/>
               </w:rPr>
               <w:tab/>
             </w:r>
             <w:r>
               <w:rPr>
-                <w:noProof/>
-                <w:webHidden/>
-                <w:sz w:val="13"/>
-                <w:szCs w:val="13"/>
+                <w:webHidden/>
               </w:rPr>
               <w:fldChar w:fldCharType="begin"/>
             </w:r>
             <w:r>
               <w:rPr>
-                <w:noProof/>
-                <w:webHidden/>
-                <w:sz w:val="13"/>
-                <w:szCs w:val="13"/>
-              </w:rPr>
-              <w:instrText xml:space="preserve"> PAGEREF _Toc232507644 \h </w:instrText>
-            </w:r>
-            <w:r>
-              <w:rPr>
-                <w:noProof/>
-                <w:webHidden/>
-                <w:sz w:val="13"/>
-                <w:szCs w:val="13"/>
-              </w:rPr>
-            </w:r>
-            <w:r>
-              <w:rPr>
-                <w:noProof/>
-                <w:webHidden/>
-                <w:sz w:val="13"/>
-                <w:szCs w:val="13"/>
+                <w:webHidden/>
+              </w:rPr>
+              <w:instrText xml:space="preserve"> PAGEREF _Toc233195708 \h </w:instrText>
+            </w:r>
+            <w:r>
+              <w:rPr>
+                <w:webHidden/>
+              </w:rPr>
+            </w:r>
+            <w:r>
+              <w:rPr>
+                <w:webHidden/>
               </w:rPr>
               <w:fldChar w:fldCharType="separate"/>
             </w:r>
             <w:r>
               <w:rPr>
-                <w:noProof/>
-                <w:webHidden/>
-                <w:sz w:val="13"/>
-                <w:szCs w:val="13"/>
+                <w:webHidden/>
               </w:rPr>
               <w:t>1</w:t>
             </w:r>
             <w:r>
               <w:rPr>
-                <w:noProof/>
-                <w:webHidden/>
-                <w:sz w:val="13"/>
-                <w:szCs w:val="13"/>
+                <w:webHidden/>
               </w:rPr>
               <w:fldChar w:fldCharType="end"/>
             </w:r>
@@ -359,85 +311,52 @@
         <w:p>
           <w:pPr>
             <w:pStyle w:val="TDC1"/>
-            <w:tabs>
-              <w:tab w:val="right" w:leader="dot" w:pos="8494"/>
-            </w:tabs>
-            <w:rPr>
-              <w:noProof/>
-              <w:sz w:val="13"/>
-              <w:szCs w:val="13"/>
-            </w:rPr>
           </w:pPr>
-          <w:hyperlink w:anchor="_Toc232507645" w:history="1">
+          <w:hyperlink w:anchor="_Toc233195709" w:history="1">
             <w:r>
               <w:rPr>
                 <w:rStyle w:val="Hipervnculo"/>
-                <w:rFonts w:ascii="Arial" w:hAnsi="Arial" w:cs="Arial"/>
-                <w:noProof/>
-                <w:sz w:val="13"/>
-                <w:szCs w:val="13"/>
               </w:rPr>
               <w:t>2. Introducción al informe</w:t>
             </w:r>
             <w:r>
               <w:rPr>
-                <w:noProof/>
-                <w:webHidden/>
-                <w:sz w:val="13"/>
-                <w:szCs w:val="13"/>
+                <w:webHidden/>
               </w:rPr>
               <w:tab/>
             </w:r>
             <w:r>
               <w:rPr>
-                <w:noProof/>
-                <w:webHidden/>
-                <w:sz w:val="13"/>
-                <w:szCs w:val="13"/>
+                <w:webHidden/>
               </w:rPr>
               <w:fldChar w:fldCharType="begin"/>
             </w:r>
             <w:r>
               <w:rPr>
-                <w:noProof/>
-                <w:webHidden/>
-                <w:sz w:val="13"/>
-                <w:szCs w:val="13"/>
-              </w:rPr>
-              <w:instrText xml:space="preserve"> PAGEREF _Toc232507645 \h </w:instrText>
-            </w:r>
-            <w:r>
-              <w:rPr>
-                <w:noProof/>
-                <w:webHidden/>
-                <w:sz w:val="13"/>
-                <w:szCs w:val="13"/>
-              </w:rPr>
-            </w:r>
-            <w:r>
-              <w:rPr>
-                <w:noProof/>
-                <w:webHidden/>
-                <w:sz w:val="13"/>
-                <w:szCs w:val="13"/>
+                <w:webHidden/>
+              </w:rPr>
+              <w:instrText xml:space="preserve"> PAGEREF _Toc233195709 \h </w:instrText>
+            </w:r>
+            <w:r>
+              <w:rPr>
+                <w:webHidden/>
+              </w:rPr>
+            </w:r>
+            <w:r>
+              <w:rPr>
+                <w:webHidden/>
               </w:rPr>
               <w:fldChar w:fldCharType="separate"/>
             </w:r>
             <w:r>
               <w:rPr>
-                <w:noProof/>
-                <w:webHidden/>
-                <w:sz w:val="13"/>
-                <w:szCs w:val="13"/>
+                <w:webHidden/>
               </w:rPr>
               <w:t>2</w:t>
             </w:r>
             <w:r>
               <w:rPr>
-                <w:noProof/>
-                <w:webHidden/>
-                <w:sz w:val="13"/>
-                <w:szCs w:val="13"/>
+                <w:webHidden/>
               </w:rPr>
               <w:fldChar w:fldCharType="end"/>
             </w:r>
@@ -455,7 +374,7 @@
               <w:szCs w:val="13"/>
             </w:rPr>
           </w:pPr>
-          <w:hyperlink w:anchor="_Toc232507646" w:history="1">
+          <w:hyperlink w:anchor="_Toc233195710" w:history="1">
             <w:r>
               <w:rPr>
                 <w:rStyle w:val="Hipervnculo"/>
@@ -491,7 +410,7 @@
                 <w:sz w:val="13"/>
                 <w:szCs w:val="13"/>
               </w:rPr>
-              <w:instrText xml:space="preserve"> PAGEREF _Toc232507646 \h </w:instrText>
+              <w:instrText xml:space="preserve"> PAGEREF _Toc233195710 \h </w:instrText>
             </w:r>
             <w:r>
               <w:rPr>
@@ -542,7 +461,7 @@
               <w:szCs w:val="13"/>
             </w:rPr>
           </w:pPr>
-          <w:hyperlink w:anchor="_Toc232507647" w:history="1">
+          <w:hyperlink w:anchor="_Toc233195711" w:history="1">
             <w:r>
               <w:rPr>
                 <w:rStyle w:val="Hipervnculo"/>
@@ -578,7 +497,7 @@
                 <w:sz w:val="13"/>
                 <w:szCs w:val="13"/>
               </w:rPr>
-              <w:instrText xml:space="preserve"> PAGEREF _Toc232507647 \h </w:instrText>
+              <w:instrText xml:space="preserve"> PAGEREF _Toc233195711 \h </w:instrText>
             </w:r>
             <w:r>
               <w:rPr>
@@ -604,7 +523,7 @@
                 <w:sz w:val="13"/>
                 <w:szCs w:val="13"/>
               </w:rPr>
-              <w:t>3</w:t>
+              <w:t>2</w:t>
             </w:r>
             <w:r>
               <w:rPr>
@@ -629,7 +548,7 @@
               <w:szCs w:val="13"/>
             </w:rPr>
           </w:pPr>
-          <w:hyperlink w:anchor="_Toc232507648" w:history="1">
+          <w:hyperlink w:anchor="_Toc233195712" w:history="1">
             <w:r>
               <w:rPr>
                 <w:rStyle w:val="Hipervnculo"/>
@@ -665,7 +584,7 @@
                 <w:sz w:val="13"/>
                 <w:szCs w:val="13"/>
               </w:rPr>
-              <w:instrText xml:space="preserve"> PAGEREF _Toc232507648 \h </w:instrText>
+              <w:instrText xml:space="preserve"> PAGEREF _Toc233195712 \h </w:instrText>
             </w:r>
             <w:r>
               <w:rPr>
@@ -691,7 +610,7 @@
                 <w:sz w:val="13"/>
                 <w:szCs w:val="13"/>
               </w:rPr>
-              <w:t>3</w:t>
+              <w:t>2</w:t>
             </w:r>
             <w:r>
               <w:rPr>
@@ -716,7 +635,7 @@
               <w:szCs w:val="13"/>
             </w:rPr>
           </w:pPr>
-          <w:hyperlink w:anchor="_Toc232507649" w:history="1">
+          <w:hyperlink w:anchor="_Toc233195713" w:history="1">
             <w:r>
               <w:rPr>
                 <w:rStyle w:val="Hipervnculo"/>
@@ -752,7 +671,7 @@
                 <w:sz w:val="13"/>
                 <w:szCs w:val="13"/>
               </w:rPr>
-              <w:instrText xml:space="preserve"> PAGEREF _Toc232507649 \h </w:instrText>
+              <w:instrText xml:space="preserve"> PAGEREF _Toc233195713 \h </w:instrText>
             </w:r>
             <w:r>
               <w:rPr>
@@ -778,7 +697,7 @@
                 <w:sz w:val="13"/>
                 <w:szCs w:val="13"/>
               </w:rPr>
-              <w:t>3</w:t>
+              <w:t>2</w:t>
             </w:r>
             <w:r>
               <w:rPr>
@@ -794,85 +713,52 @@
         <w:p>
           <w:pPr>
             <w:pStyle w:val="TDC1"/>
-            <w:tabs>
-              <w:tab w:val="right" w:leader="dot" w:pos="8494"/>
-            </w:tabs>
-            <w:rPr>
-              <w:noProof/>
-              <w:sz w:val="13"/>
-              <w:szCs w:val="13"/>
-            </w:rPr>
           </w:pPr>
-          <w:hyperlink w:anchor="_Toc232507650" w:history="1">
+          <w:hyperlink w:anchor="_Toc233195714" w:history="1">
             <w:r>
               <w:rPr>
                 <w:rStyle w:val="Hipervnculo"/>
-                <w:rFonts w:ascii="Arial" w:hAnsi="Arial" w:cs="Arial"/>
-                <w:noProof/>
-                <w:sz w:val="13"/>
-                <w:szCs w:val="13"/>
               </w:rPr>
               <w:t>3. Descripción de los datos</w:t>
             </w:r>
             <w:r>
               <w:rPr>
-                <w:noProof/>
-                <w:webHidden/>
-                <w:sz w:val="13"/>
-                <w:szCs w:val="13"/>
+                <w:webHidden/>
               </w:rPr>
               <w:tab/>
             </w:r>
             <w:r>
               <w:rPr>
-                <w:noProof/>
-                <w:webHidden/>
-                <w:sz w:val="13"/>
-                <w:szCs w:val="13"/>
+                <w:webHidden/>
               </w:rPr>
               <w:fldChar w:fldCharType="begin"/>
             </w:r>
             <w:r>
               <w:rPr>
-                <w:noProof/>
-                <w:webHidden/>
-                <w:sz w:val="13"/>
-                <w:szCs w:val="13"/>
-              </w:rPr>
-              <w:instrText xml:space="preserve"> PAGEREF _Toc232507650 \h </w:instrText>
-            </w:r>
-            <w:r>
-              <w:rPr>
-                <w:noProof/>
-                <w:webHidden/>
-                <w:sz w:val="13"/>
-                <w:szCs w:val="13"/>
-              </w:rPr>
-            </w:r>
-            <w:r>
-              <w:rPr>
-                <w:noProof/>
-                <w:webHidden/>
-                <w:sz w:val="13"/>
-                <w:szCs w:val="13"/>
+                <w:webHidden/>
+              </w:rPr>
+              <w:instrText xml:space="preserve"> PAGEREF _Toc233195714 \h </w:instrText>
+            </w:r>
+            <w:r>
+              <w:rPr>
+                <w:webHidden/>
+              </w:rPr>
+            </w:r>
+            <w:r>
+              <w:rPr>
+                <w:webHidden/>
               </w:rPr>
               <w:fldChar w:fldCharType="separate"/>
             </w:r>
             <w:r>
               <w:rPr>
-                <w:noProof/>
-                <w:webHidden/>
-                <w:sz w:val="13"/>
-                <w:szCs w:val="13"/>
+                <w:webHidden/>
               </w:rPr>
               <w:t>3</w:t>
             </w:r>
             <w:r>
               <w:rPr>
-                <w:noProof/>
-                <w:webHidden/>
-                <w:sz w:val="13"/>
-                <w:szCs w:val="13"/>
+                <w:webHidden/>
               </w:rPr>
               <w:fldChar w:fldCharType="end"/>
             </w:r>
@@ -890,7 +776,7 @@
               <w:szCs w:val="13"/>
             </w:rPr>
           </w:pPr>
-          <w:hyperlink w:anchor="_Toc232507651" w:history="1">
+          <w:hyperlink w:anchor="_Toc233195715" w:history="1">
             <w:r>
               <w:rPr>
                 <w:rStyle w:val="Hipervnculo"/>
@@ -926,7 +812,7 @@
                 <w:sz w:val="13"/>
                 <w:szCs w:val="13"/>
               </w:rPr>
-              <w:instrText xml:space="preserve"> PAGEREF _Toc232507651 \h </w:instrText>
+              <w:instrText xml:space="preserve"> PAGEREF _Toc233195715 \h </w:instrText>
             </w:r>
             <w:r>
               <w:rPr>
@@ -977,7 +863,7 @@
               <w:szCs w:val="13"/>
             </w:rPr>
           </w:pPr>
-          <w:hyperlink w:anchor="_Toc232507652" w:history="1">
+          <w:hyperlink w:anchor="_Toc233195716" w:history="1">
             <w:r>
               <w:rPr>
                 <w:rStyle w:val="Hipervnculo"/>
@@ -1013,7 +899,7 @@
                 <w:sz w:val="13"/>
                 <w:szCs w:val="13"/>
               </w:rPr>
-              <w:instrText xml:space="preserve"> PAGEREF _Toc232507652 \h </w:instrText>
+              <w:instrText xml:space="preserve"> PAGEREF _Toc233195716 \h </w:instrText>
             </w:r>
             <w:r>
               <w:rPr>
@@ -1064,7 +950,7 @@
               <w:szCs w:val="13"/>
             </w:rPr>
           </w:pPr>
-          <w:hyperlink w:anchor="_Toc232507653" w:history="1">
+          <w:hyperlink w:anchor="_Toc233195717" w:history="1">
             <w:r>
               <w:rPr>
                 <w:rStyle w:val="Hipervnculo"/>
@@ -1100,7 +986,7 @@
                 <w:sz w:val="13"/>
                 <w:szCs w:val="13"/>
               </w:rPr>
-              <w:instrText xml:space="preserve"> PAGEREF _Toc232507653 \h </w:instrText>
+              <w:instrText xml:space="preserve"> PAGEREF _Toc233195717 \h </w:instrText>
             </w:r>
             <w:r>
               <w:rPr>
@@ -1142,85 +1028,52 @@
         <w:p>
           <w:pPr>
             <w:pStyle w:val="TDC1"/>
-            <w:tabs>
-              <w:tab w:val="right" w:leader="dot" w:pos="8494"/>
-            </w:tabs>
-            <w:rPr>
-              <w:noProof/>
-              <w:sz w:val="13"/>
-              <w:szCs w:val="13"/>
-            </w:rPr>
           </w:pPr>
-          <w:hyperlink w:anchor="_Toc232507654" w:history="1">
+          <w:hyperlink w:anchor="_Toc233195718" w:history="1">
             <w:r>
               <w:rPr>
                 <w:rStyle w:val="Hipervnculo"/>
-                <w:rFonts w:ascii="Arial" w:hAnsi="Arial" w:cs="Arial"/>
-                <w:noProof/>
-                <w:sz w:val="13"/>
-                <w:szCs w:val="13"/>
               </w:rPr>
               <w:t>4. Preparación y limpieza</w:t>
             </w:r>
             <w:r>
               <w:rPr>
-                <w:noProof/>
-                <w:webHidden/>
-                <w:sz w:val="13"/>
-                <w:szCs w:val="13"/>
+                <w:webHidden/>
               </w:rPr>
               <w:tab/>
             </w:r>
             <w:r>
               <w:rPr>
-                <w:noProof/>
-                <w:webHidden/>
-                <w:sz w:val="13"/>
-                <w:szCs w:val="13"/>
+                <w:webHidden/>
               </w:rPr>
               <w:fldChar w:fldCharType="begin"/>
             </w:r>
             <w:r>
               <w:rPr>
-                <w:noProof/>
-                <w:webHidden/>
-                <w:sz w:val="13"/>
-                <w:szCs w:val="13"/>
-              </w:rPr>
-              <w:instrText xml:space="preserve"> PAGEREF _Toc232507654 \h </w:instrText>
-            </w:r>
-            <w:r>
-              <w:rPr>
-                <w:noProof/>
-                <w:webHidden/>
-                <w:sz w:val="13"/>
-                <w:szCs w:val="13"/>
-              </w:rPr>
-            </w:r>
-            <w:r>
-              <w:rPr>
-                <w:noProof/>
-                <w:webHidden/>
-                <w:sz w:val="13"/>
-                <w:szCs w:val="13"/>
+                <w:webHidden/>
+              </w:rPr>
+              <w:instrText xml:space="preserve"> PAGEREF _Toc233195718 \h </w:instrText>
+            </w:r>
+            <w:r>
+              <w:rPr>
+                <w:webHidden/>
+              </w:rPr>
+            </w:r>
+            <w:r>
+              <w:rPr>
+                <w:webHidden/>
               </w:rPr>
               <w:fldChar w:fldCharType="separate"/>
             </w:r>
             <w:r>
               <w:rPr>
-                <w:noProof/>
-                <w:webHidden/>
-                <w:sz w:val="13"/>
-                <w:szCs w:val="13"/>
-              </w:rPr>
-              <w:t>4</w:t>
-            </w:r>
-            <w:r>
-              <w:rPr>
-                <w:noProof/>
-                <w:webHidden/>
-                <w:sz w:val="13"/>
-                <w:szCs w:val="13"/>
+                <w:webHidden/>
+              </w:rPr>
+              <w:t>3</w:t>
+            </w:r>
+            <w:r>
+              <w:rPr>
+                <w:webHidden/>
               </w:rPr>
               <w:fldChar w:fldCharType="end"/>
             </w:r>
@@ -1238,7 +1091,7 @@
               <w:szCs w:val="13"/>
             </w:rPr>
           </w:pPr>
-          <w:hyperlink w:anchor="_Toc232507655" w:history="1">
+          <w:hyperlink w:anchor="_Toc233195719" w:history="1">
             <w:r>
               <w:rPr>
                 <w:rStyle w:val="Hipervnculo"/>
@@ -1274,7 +1127,7 @@
                 <w:sz w:val="13"/>
                 <w:szCs w:val="13"/>
               </w:rPr>
-              <w:instrText xml:space="preserve"> PAGEREF _Toc232507655 \h </w:instrText>
+              <w:instrText xml:space="preserve"> PAGEREF _Toc233195719 \h </w:instrText>
             </w:r>
             <w:r>
               <w:rPr>
@@ -1300,7 +1153,7 @@
                 <w:sz w:val="13"/>
                 <w:szCs w:val="13"/>
               </w:rPr>
-              <w:t>4</w:t>
+              <w:t>3</w:t>
             </w:r>
             <w:r>
               <w:rPr>
@@ -1325,7 +1178,7 @@
               <w:szCs w:val="13"/>
             </w:rPr>
           </w:pPr>
-          <w:hyperlink w:anchor="_Toc232507656" w:history="1">
+          <w:hyperlink w:anchor="_Toc233195720" w:history="1">
             <w:r>
               <w:rPr>
                 <w:rStyle w:val="Hipervnculo"/>
@@ -1361,7 +1214,7 @@
                 <w:sz w:val="13"/>
                 <w:szCs w:val="13"/>
               </w:rPr>
-              <w:instrText xml:space="preserve"> PAGEREF _Toc232507656 \h </w:instrText>
+              <w:instrText xml:space="preserve"> PAGEREF _Toc233195720 \h </w:instrText>
             </w:r>
             <w:r>
               <w:rPr>
@@ -1412,7 +1265,7 @@
               <w:szCs w:val="13"/>
             </w:rPr>
           </w:pPr>
-          <w:hyperlink w:anchor="_Toc232507657" w:history="1">
+          <w:hyperlink w:anchor="_Toc233195721" w:history="1">
             <w:r>
               <w:rPr>
                 <w:rStyle w:val="Hipervnculo"/>
@@ -1448,7 +1301,7 @@
                 <w:sz w:val="13"/>
                 <w:szCs w:val="13"/>
               </w:rPr>
-              <w:instrText xml:space="preserve"> PAGEREF _Toc232507657 \h </w:instrText>
+              <w:instrText xml:space="preserve"> PAGEREF _Toc233195721 \h </w:instrText>
             </w:r>
             <w:r>
               <w:rPr>
@@ -1490,85 +1343,52 @@
         <w:p>
           <w:pPr>
             <w:pStyle w:val="TDC1"/>
-            <w:tabs>
-              <w:tab w:val="right" w:leader="dot" w:pos="8494"/>
-            </w:tabs>
-            <w:rPr>
-              <w:noProof/>
-              <w:sz w:val="13"/>
-              <w:szCs w:val="13"/>
-            </w:rPr>
           </w:pPr>
-          <w:hyperlink w:anchor="_Toc232507658" w:history="1">
+          <w:hyperlink w:anchor="_Toc233195722" w:history="1">
             <w:r>
               <w:rPr>
                 <w:rStyle w:val="Hipervnculo"/>
-                <w:rFonts w:ascii="Arial" w:hAnsi="Arial" w:cs="Arial"/>
-                <w:noProof/>
-                <w:sz w:val="13"/>
-                <w:szCs w:val="13"/>
               </w:rPr>
               <w:t>5.Modelado y almacenamiento</w:t>
             </w:r>
             <w:r>
               <w:rPr>
-                <w:noProof/>
-                <w:webHidden/>
-                <w:sz w:val="13"/>
-                <w:szCs w:val="13"/>
+                <w:webHidden/>
               </w:rPr>
               <w:tab/>
             </w:r>
             <w:r>
               <w:rPr>
-                <w:noProof/>
-                <w:webHidden/>
-                <w:sz w:val="13"/>
-                <w:szCs w:val="13"/>
+                <w:webHidden/>
               </w:rPr>
               <w:fldChar w:fldCharType="begin"/>
             </w:r>
             <w:r>
               <w:rPr>
-                <w:noProof/>
-                <w:webHidden/>
-                <w:sz w:val="13"/>
-                <w:szCs w:val="13"/>
-              </w:rPr>
-              <w:instrText xml:space="preserve"> PAGEREF _Toc232507658 \h </w:instrText>
-            </w:r>
-            <w:r>
-              <w:rPr>
-                <w:noProof/>
-                <w:webHidden/>
-                <w:sz w:val="13"/>
-                <w:szCs w:val="13"/>
-              </w:rPr>
-            </w:r>
-            <w:r>
-              <w:rPr>
-                <w:noProof/>
-                <w:webHidden/>
-                <w:sz w:val="13"/>
-                <w:szCs w:val="13"/>
+                <w:webHidden/>
+              </w:rPr>
+              <w:instrText xml:space="preserve"> PAGEREF _Toc233195722 \h </w:instrText>
+            </w:r>
+            <w:r>
+              <w:rPr>
+                <w:webHidden/>
+              </w:rPr>
+            </w:r>
+            <w:r>
+              <w:rPr>
+                <w:webHidden/>
               </w:rPr>
               <w:fldChar w:fldCharType="separate"/>
             </w:r>
             <w:r>
               <w:rPr>
-                <w:noProof/>
-                <w:webHidden/>
-                <w:sz w:val="13"/>
-                <w:szCs w:val="13"/>
-              </w:rPr>
-              <w:t>5</w:t>
-            </w:r>
-            <w:r>
-              <w:rPr>
-                <w:noProof/>
-                <w:webHidden/>
-                <w:sz w:val="13"/>
-                <w:szCs w:val="13"/>
+                <w:webHidden/>
+              </w:rPr>
+              <w:t>4</w:t>
+            </w:r>
+            <w:r>
+              <w:rPr>
+                <w:webHidden/>
               </w:rPr>
               <w:fldChar w:fldCharType="end"/>
             </w:r>
@@ -1586,7 +1406,7 @@
               <w:szCs w:val="13"/>
             </w:rPr>
           </w:pPr>
-          <w:hyperlink w:anchor="_Toc232507659" w:history="1">
+          <w:hyperlink w:anchor="_Toc233195723" w:history="1">
             <w:r>
               <w:rPr>
                 <w:rStyle w:val="Hipervnculo"/>
@@ -1622,7 +1442,7 @@
                 <w:sz w:val="13"/>
                 <w:szCs w:val="13"/>
               </w:rPr>
-              <w:instrText xml:space="preserve"> PAGEREF _Toc232507659 \h </w:instrText>
+              <w:instrText xml:space="preserve"> PAGEREF _Toc233195723 \h </w:instrText>
             </w:r>
             <w:r>
               <w:rPr>
@@ -1648,7 +1468,7 @@
                 <w:sz w:val="13"/>
                 <w:szCs w:val="13"/>
               </w:rPr>
-              <w:t>5</w:t>
+              <w:t>4</w:t>
             </w:r>
             <w:r>
               <w:rPr>
@@ -1673,7 +1493,7 @@
               <w:szCs w:val="13"/>
             </w:rPr>
           </w:pPr>
-          <w:hyperlink w:anchor="_Toc232507660" w:history="1">
+          <w:hyperlink w:anchor="_Toc233195724" w:history="1">
             <w:r>
               <w:rPr>
                 <w:rStyle w:val="Hipervnculo"/>
@@ -1709,7 +1529,7 @@
                 <w:sz w:val="13"/>
                 <w:szCs w:val="13"/>
               </w:rPr>
-              <w:instrText xml:space="preserve"> PAGEREF _Toc232507660 \h </w:instrText>
+              <w:instrText xml:space="preserve"> PAGEREF _Toc233195724 \h </w:instrText>
             </w:r>
             <w:r>
               <w:rPr>
@@ -1735,7 +1555,7 @@
                 <w:sz w:val="13"/>
                 <w:szCs w:val="13"/>
               </w:rPr>
-              <w:t>5</w:t>
+              <w:t>4</w:t>
             </w:r>
             <w:r>
               <w:rPr>
@@ -1760,7 +1580,7 @@
               <w:szCs w:val="13"/>
             </w:rPr>
           </w:pPr>
-          <w:hyperlink w:anchor="_Toc232507661" w:history="1">
+          <w:hyperlink w:anchor="_Toc233195725" w:history="1">
             <w:r>
               <w:rPr>
                 <w:rStyle w:val="Hipervnculo"/>
@@ -1796,7 +1616,7 @@
                 <w:sz w:val="13"/>
                 <w:szCs w:val="13"/>
               </w:rPr>
-              <w:instrText xml:space="preserve"> PAGEREF _Toc232507661 \h </w:instrText>
+              <w:instrText xml:space="preserve"> PAGEREF _Toc233195725 \h </w:instrText>
             </w:r>
             <w:r>
               <w:rPr>
@@ -1822,7 +1642,7 @@
                 <w:sz w:val="13"/>
                 <w:szCs w:val="13"/>
               </w:rPr>
-              <w:t>6</w:t>
+              <w:t>5</w:t>
             </w:r>
             <w:r>
               <w:rPr>
@@ -1838,85 +1658,52 @@
         <w:p>
           <w:pPr>
             <w:pStyle w:val="TDC1"/>
-            <w:tabs>
-              <w:tab w:val="right" w:leader="dot" w:pos="8494"/>
-            </w:tabs>
-            <w:rPr>
-              <w:noProof/>
-              <w:sz w:val="13"/>
-              <w:szCs w:val="13"/>
-            </w:rPr>
           </w:pPr>
-          <w:hyperlink w:anchor="_Toc232507662" w:history="1">
+          <w:hyperlink w:anchor="_Toc233195726" w:history="1">
             <w:r>
               <w:rPr>
                 <w:rStyle w:val="Hipervnculo"/>
-                <w:rFonts w:ascii="Arial" w:hAnsi="Arial" w:cs="Arial"/>
-                <w:noProof/>
-                <w:sz w:val="13"/>
-                <w:szCs w:val="13"/>
               </w:rPr>
               <w:t>6. Análisis Exploratorio (EDA)</w:t>
             </w:r>
             <w:r>
               <w:rPr>
-                <w:noProof/>
-                <w:webHidden/>
-                <w:sz w:val="13"/>
-                <w:szCs w:val="13"/>
+                <w:webHidden/>
               </w:rPr>
               <w:tab/>
             </w:r>
             <w:r>
               <w:rPr>
-                <w:noProof/>
-                <w:webHidden/>
-                <w:sz w:val="13"/>
-                <w:szCs w:val="13"/>
+                <w:webHidden/>
               </w:rPr>
               <w:fldChar w:fldCharType="begin"/>
             </w:r>
             <w:r>
               <w:rPr>
-                <w:noProof/>
-                <w:webHidden/>
-                <w:sz w:val="13"/>
-                <w:szCs w:val="13"/>
-              </w:rPr>
-              <w:instrText xml:space="preserve"> PAGEREF _Toc232507662 \h </w:instrText>
-            </w:r>
-            <w:r>
-              <w:rPr>
-                <w:noProof/>
-                <w:webHidden/>
-                <w:sz w:val="13"/>
-                <w:szCs w:val="13"/>
-              </w:rPr>
-            </w:r>
-            <w:r>
-              <w:rPr>
-                <w:noProof/>
-                <w:webHidden/>
-                <w:sz w:val="13"/>
-                <w:szCs w:val="13"/>
+                <w:webHidden/>
+              </w:rPr>
+              <w:instrText xml:space="preserve"> PAGEREF _Toc233195726 \h </w:instrText>
+            </w:r>
+            <w:r>
+              <w:rPr>
+                <w:webHidden/>
+              </w:rPr>
+            </w:r>
+            <w:r>
+              <w:rPr>
+                <w:webHidden/>
               </w:rPr>
               <w:fldChar w:fldCharType="separate"/>
             </w:r>
             <w:r>
               <w:rPr>
-                <w:noProof/>
-                <w:webHidden/>
-                <w:sz w:val="13"/>
-                <w:szCs w:val="13"/>
+                <w:webHidden/>
               </w:rPr>
               <w:t>6</w:t>
             </w:r>
             <w:r>
               <w:rPr>
-                <w:noProof/>
-                <w:webHidden/>
-                <w:sz w:val="13"/>
-                <w:szCs w:val="13"/>
+                <w:webHidden/>
               </w:rPr>
               <w:fldChar w:fldCharType="end"/>
             </w:r>
@@ -1934,7 +1721,7 @@
               <w:szCs w:val="13"/>
             </w:rPr>
           </w:pPr>
-          <w:hyperlink w:anchor="_Toc232507663" w:history="1">
+          <w:hyperlink w:anchor="_Toc233195727" w:history="1">
             <w:r>
               <w:rPr>
                 <w:rStyle w:val="Hipervnculo"/>
@@ -1970,7 +1757,7 @@
                 <w:sz w:val="13"/>
                 <w:szCs w:val="13"/>
               </w:rPr>
-              <w:instrText xml:space="preserve"> PAGEREF _Toc232507663 \h </w:instrText>
+              <w:instrText xml:space="preserve"> PAGEREF _Toc233195727 \h </w:instrText>
             </w:r>
             <w:r>
               <w:rPr>
@@ -2021,7 +1808,7 @@
               <w:szCs w:val="13"/>
             </w:rPr>
           </w:pPr>
-          <w:hyperlink w:anchor="_Toc232507664" w:history="1">
+          <w:hyperlink w:anchor="_Toc233195728" w:history="1">
             <w:r>
               <w:rPr>
                 <w:rStyle w:val="Hipervnculo"/>
@@ -2057,7 +1844,7 @@
                 <w:sz w:val="13"/>
                 <w:szCs w:val="13"/>
               </w:rPr>
-              <w:instrText xml:space="preserve"> PAGEREF _Toc232507664 \h </w:instrText>
+              <w:instrText xml:space="preserve"> PAGEREF _Toc233195728 \h </w:instrText>
             </w:r>
             <w:r>
               <w:rPr>
@@ -2083,7 +1870,7 @@
                 <w:sz w:val="13"/>
                 <w:szCs w:val="13"/>
               </w:rPr>
-              <w:t>7</w:t>
+              <w:t>6</w:t>
             </w:r>
             <w:r>
               <w:rPr>
@@ -2108,7 +1895,7 @@
               <w:szCs w:val="13"/>
             </w:rPr>
           </w:pPr>
-          <w:hyperlink w:anchor="_Toc232507665" w:history="1">
+          <w:hyperlink w:anchor="_Toc233195729" w:history="1">
             <w:r>
               <w:rPr>
                 <w:rStyle w:val="Hipervnculo"/>
@@ -2144,7 +1931,7 @@
                 <w:sz w:val="13"/>
                 <w:szCs w:val="13"/>
               </w:rPr>
-              <w:instrText xml:space="preserve"> PAGEREF _Toc232507665 \h </w:instrText>
+              <w:instrText xml:space="preserve"> PAGEREF _Toc233195729 \h </w:instrText>
             </w:r>
             <w:r>
               <w:rPr>
@@ -2170,7 +1957,7 @@
                 <w:sz w:val="13"/>
                 <w:szCs w:val="13"/>
               </w:rPr>
-              <w:t>7</w:t>
+              <w:t>6</w:t>
             </w:r>
             <w:r>
               <w:rPr>
@@ -2195,7 +1982,7 @@
               <w:szCs w:val="13"/>
             </w:rPr>
           </w:pPr>
-          <w:hyperlink w:anchor="_Toc232507666" w:history="1">
+          <w:hyperlink w:anchor="_Toc233195730" w:history="1">
             <w:r>
               <w:rPr>
                 <w:rStyle w:val="Hipervnculo"/>
@@ -2231,7 +2018,7 @@
                 <w:sz w:val="13"/>
                 <w:szCs w:val="13"/>
               </w:rPr>
-              <w:instrText xml:space="preserve"> PAGEREF _Toc232507666 \h </w:instrText>
+              <w:instrText xml:space="preserve"> PAGEREF _Toc233195730 \h </w:instrText>
             </w:r>
             <w:r>
               <w:rPr>
@@ -2257,7 +2044,7 @@
                 <w:sz w:val="13"/>
                 <w:szCs w:val="13"/>
               </w:rPr>
-              <w:t>7</w:t>
+              <w:t>6</w:t>
             </w:r>
             <w:r>
               <w:rPr>
@@ -2282,7 +2069,7 @@
               <w:szCs w:val="13"/>
             </w:rPr>
           </w:pPr>
-          <w:hyperlink w:anchor="_Toc232507667" w:history="1">
+          <w:hyperlink w:anchor="_Toc233195731" w:history="1">
             <w:r>
               <w:rPr>
                 <w:rStyle w:val="Hipervnculo"/>
@@ -2318,7 +2105,7 @@
                 <w:sz w:val="13"/>
                 <w:szCs w:val="13"/>
               </w:rPr>
-              <w:instrText xml:space="preserve"> PAGEREF _Toc232507667 \h </w:instrText>
+              <w:instrText xml:space="preserve"> PAGEREF _Toc233195731 \h </w:instrText>
             </w:r>
             <w:r>
               <w:rPr>
@@ -2344,7 +2131,7 @@
                 <w:sz w:val="13"/>
                 <w:szCs w:val="13"/>
               </w:rPr>
-              <w:t>8</w:t>
+              <w:t>7</w:t>
             </w:r>
             <w:r>
               <w:rPr>
@@ -2369,7 +2156,7 @@
               <w:szCs w:val="13"/>
             </w:rPr>
           </w:pPr>
-          <w:hyperlink w:anchor="_Toc232507668" w:history="1">
+          <w:hyperlink w:anchor="_Toc233195732" w:history="1">
             <w:r>
               <w:rPr>
                 <w:rStyle w:val="Hipervnculo"/>
@@ -2405,7 +2192,7 @@
                 <w:sz w:val="13"/>
                 <w:szCs w:val="13"/>
               </w:rPr>
-              <w:instrText xml:space="preserve"> PAGEREF _Toc232507668 \h </w:instrText>
+              <w:instrText xml:space="preserve"> PAGEREF _Toc233195732 \h </w:instrText>
             </w:r>
             <w:r>
               <w:rPr>
@@ -2431,7 +2218,7 @@
                 <w:sz w:val="13"/>
                 <w:szCs w:val="13"/>
               </w:rPr>
-              <w:t>8</w:t>
+              <w:t>7</w:t>
             </w:r>
             <w:r>
               <w:rPr>
@@ -2456,7 +2243,7 @@
               <w:szCs w:val="13"/>
             </w:rPr>
           </w:pPr>
-          <w:hyperlink w:anchor="_Toc232507669" w:history="1">
+          <w:hyperlink w:anchor="_Toc233195733" w:history="1">
             <w:r>
               <w:rPr>
                 <w:rStyle w:val="Hipervnculo"/>
@@ -2492,7 +2279,7 @@
                 <w:sz w:val="13"/>
                 <w:szCs w:val="13"/>
               </w:rPr>
-              <w:instrText xml:space="preserve"> PAGEREF _Toc232507669 \h </w:instrText>
+              <w:instrText xml:space="preserve"> PAGEREF _Toc233195733 \h </w:instrText>
             </w:r>
             <w:r>
               <w:rPr>
@@ -2518,7 +2305,7 @@
                 <w:sz w:val="13"/>
                 <w:szCs w:val="13"/>
               </w:rPr>
-              <w:t>8</w:t>
+              <w:t>7</w:t>
             </w:r>
             <w:r>
               <w:rPr>
@@ -2543,7 +2330,7 @@
               <w:szCs w:val="13"/>
             </w:rPr>
           </w:pPr>
-          <w:hyperlink w:anchor="_Toc232507670" w:history="1">
+          <w:hyperlink w:anchor="_Toc233195734" w:history="1">
             <w:r>
               <w:rPr>
                 <w:rStyle w:val="Hipervnculo"/>
@@ -2579,7 +2366,7 @@
                 <w:sz w:val="13"/>
                 <w:szCs w:val="13"/>
               </w:rPr>
-              <w:instrText xml:space="preserve"> PAGEREF _Toc232507670 \h </w:instrText>
+              <w:instrText xml:space="preserve"> PAGEREF _Toc233195734 \h </w:instrText>
             </w:r>
             <w:r>
               <w:rPr>
@@ -2630,7 +2417,7 @@
               <w:szCs w:val="13"/>
             </w:rPr>
           </w:pPr>
-          <w:hyperlink w:anchor="_Toc232507671" w:history="1">
+          <w:hyperlink w:anchor="_Toc233195735" w:history="1">
             <w:r>
               <w:rPr>
                 <w:rStyle w:val="Hipervnculo"/>
@@ -2666,7 +2453,7 @@
                 <w:sz w:val="13"/>
                 <w:szCs w:val="13"/>
               </w:rPr>
-              <w:instrText xml:space="preserve"> PAGEREF _Toc232507671 \h </w:instrText>
+              <w:instrText xml:space="preserve"> PAGEREF _Toc233195735 \h </w:instrText>
             </w:r>
             <w:r>
               <w:rPr>
@@ -2692,7 +2479,7 @@
                 <w:sz w:val="13"/>
                 <w:szCs w:val="13"/>
               </w:rPr>
-              <w:t>9</w:t>
+              <w:t>8</w:t>
             </w:r>
             <w:r>
               <w:rPr>
@@ -2717,7 +2504,7 @@
               <w:szCs w:val="13"/>
             </w:rPr>
           </w:pPr>
-          <w:hyperlink w:anchor="_Toc232507672" w:history="1">
+          <w:hyperlink w:anchor="_Toc233195736" w:history="1">
             <w:r>
               <w:rPr>
                 <w:rStyle w:val="Hipervnculo"/>
@@ -2753,7 +2540,7 @@
                 <w:sz w:val="13"/>
                 <w:szCs w:val="13"/>
               </w:rPr>
-              <w:instrText xml:space="preserve"> PAGEREF _Toc232507672 \h </w:instrText>
+              <w:instrText xml:space="preserve"> PAGEREF _Toc233195736 \h </w:instrText>
             </w:r>
             <w:r>
               <w:rPr>
@@ -2804,7 +2591,7 @@
               <w:szCs w:val="13"/>
             </w:rPr>
           </w:pPr>
-          <w:hyperlink w:anchor="_Toc232507673" w:history="1">
+          <w:hyperlink w:anchor="_Toc233195737" w:history="1">
             <w:r>
               <w:rPr>
                 <w:rStyle w:val="Hipervnculo"/>
@@ -2840,7 +2627,7 @@
                 <w:sz w:val="13"/>
                 <w:szCs w:val="13"/>
               </w:rPr>
-              <w:instrText xml:space="preserve"> PAGEREF _Toc232507673 \h </w:instrText>
+              <w:instrText xml:space="preserve"> PAGEREF _Toc233195737 \h </w:instrText>
             </w:r>
             <w:r>
               <w:rPr>
@@ -2866,7 +2653,7 @@
                 <w:sz w:val="13"/>
                 <w:szCs w:val="13"/>
               </w:rPr>
-              <w:t>10</w:t>
+              <w:t>9</w:t>
             </w:r>
             <w:r>
               <w:rPr>
@@ -2891,7 +2678,7 @@
               <w:szCs w:val="13"/>
             </w:rPr>
           </w:pPr>
-          <w:hyperlink w:anchor="_Toc232507674" w:history="1">
+          <w:hyperlink w:anchor="_Toc233195738" w:history="1">
             <w:r>
               <w:rPr>
                 <w:rStyle w:val="Hipervnculo"/>
@@ -2927,7 +2714,7 @@
                 <w:sz w:val="13"/>
                 <w:szCs w:val="13"/>
               </w:rPr>
-              <w:instrText xml:space="preserve"> PAGEREF _Toc232507674 \h </w:instrText>
+              <w:instrText xml:space="preserve"> PAGEREF _Toc233195738 \h </w:instrText>
             </w:r>
             <w:r>
               <w:rPr>
@@ -2953,7 +2740,7 @@
                 <w:sz w:val="13"/>
                 <w:szCs w:val="13"/>
               </w:rPr>
-              <w:t>10</w:t>
+              <w:t>9</w:t>
             </w:r>
             <w:r>
               <w:rPr>
@@ -2978,7 +2765,7 @@
               <w:szCs w:val="13"/>
             </w:rPr>
           </w:pPr>
-          <w:hyperlink w:anchor="_Toc232507675" w:history="1">
+          <w:hyperlink w:anchor="_Toc233195739" w:history="1">
             <w:r>
               <w:rPr>
                 <w:rStyle w:val="Hipervnculo"/>
@@ -3014,7 +2801,7 @@
                 <w:sz w:val="13"/>
                 <w:szCs w:val="13"/>
               </w:rPr>
-              <w:instrText xml:space="preserve"> PAGEREF _Toc232507675 \h </w:instrText>
+              <w:instrText xml:space="preserve"> PAGEREF _Toc233195739 \h </w:instrText>
             </w:r>
             <w:r>
               <w:rPr>
@@ -3056,85 +2843,52 @@
         <w:p>
           <w:pPr>
             <w:pStyle w:val="TDC1"/>
-            <w:tabs>
-              <w:tab w:val="right" w:leader="dot" w:pos="8494"/>
-            </w:tabs>
-            <w:rPr>
-              <w:noProof/>
-              <w:sz w:val="13"/>
-              <w:szCs w:val="13"/>
-            </w:rPr>
           </w:pPr>
-          <w:hyperlink w:anchor="_Toc232507676" w:history="1">
+          <w:hyperlink w:anchor="_Toc233195740" w:history="1">
             <w:r>
               <w:rPr>
                 <w:rStyle w:val="Hipervnculo"/>
-                <w:rFonts w:ascii="Arial" w:hAnsi="Arial" w:cs="Arial"/>
-                <w:noProof/>
-                <w:sz w:val="13"/>
-                <w:szCs w:val="13"/>
               </w:rPr>
               <w:t>7. Visualización y Storytelling</w:t>
             </w:r>
             <w:r>
               <w:rPr>
-                <w:noProof/>
-                <w:webHidden/>
-                <w:sz w:val="13"/>
-                <w:szCs w:val="13"/>
+                <w:webHidden/>
               </w:rPr>
               <w:tab/>
             </w:r>
             <w:r>
               <w:rPr>
-                <w:noProof/>
-                <w:webHidden/>
-                <w:sz w:val="13"/>
-                <w:szCs w:val="13"/>
+                <w:webHidden/>
               </w:rPr>
               <w:fldChar w:fldCharType="begin"/>
             </w:r>
             <w:r>
               <w:rPr>
-                <w:noProof/>
-                <w:webHidden/>
-                <w:sz w:val="13"/>
-                <w:szCs w:val="13"/>
-              </w:rPr>
-              <w:instrText xml:space="preserve"> PAGEREF _Toc232507676 \h </w:instrText>
-            </w:r>
-            <w:r>
-              <w:rPr>
-                <w:noProof/>
-                <w:webHidden/>
-                <w:sz w:val="13"/>
-                <w:szCs w:val="13"/>
-              </w:rPr>
-            </w:r>
-            <w:r>
-              <w:rPr>
-                <w:noProof/>
-                <w:webHidden/>
-                <w:sz w:val="13"/>
-                <w:szCs w:val="13"/>
+                <w:webHidden/>
+              </w:rPr>
+              <w:instrText xml:space="preserve"> PAGEREF _Toc233195740 \h </w:instrText>
+            </w:r>
+            <w:r>
+              <w:rPr>
+                <w:webHidden/>
+              </w:rPr>
+            </w:r>
+            <w:r>
+              <w:rPr>
+                <w:webHidden/>
               </w:rPr>
               <w:fldChar w:fldCharType="separate"/>
             </w:r>
             <w:r>
               <w:rPr>
-                <w:noProof/>
-                <w:webHidden/>
-                <w:sz w:val="13"/>
-                <w:szCs w:val="13"/>
-              </w:rPr>
-              <w:t>11</w:t>
-            </w:r>
-            <w:r>
-              <w:rPr>
-                <w:noProof/>
-                <w:webHidden/>
-                <w:sz w:val="13"/>
-                <w:szCs w:val="13"/>
+                <w:webHidden/>
+              </w:rPr>
+              <w:t>10</w:t>
+            </w:r>
+            <w:r>
+              <w:rPr>
+                <w:webHidden/>
               </w:rPr>
               <w:fldChar w:fldCharType="end"/>
             </w:r>
@@ -3152,7 +2906,7 @@
               <w:szCs w:val="13"/>
             </w:rPr>
           </w:pPr>
-          <w:hyperlink w:anchor="_Toc232507677" w:history="1">
+          <w:hyperlink w:anchor="_Toc233195741" w:history="1">
             <w:r>
               <w:rPr>
                 <w:rStyle w:val="Hipervnculo"/>
@@ -3188,7 +2942,7 @@
                 <w:sz w:val="13"/>
                 <w:szCs w:val="13"/>
               </w:rPr>
-              <w:instrText xml:space="preserve"> PAGEREF _Toc232507677 \h </w:instrText>
+              <w:instrText xml:space="preserve"> PAGEREF _Toc233195741 \h </w:instrText>
             </w:r>
             <w:r>
               <w:rPr>
@@ -3214,7 +2968,7 @@
                 <w:sz w:val="13"/>
                 <w:szCs w:val="13"/>
               </w:rPr>
-              <w:t>11</w:t>
+              <w:t>10</w:t>
             </w:r>
             <w:r>
               <w:rPr>
@@ -3239,7 +2993,7 @@
               <w:szCs w:val="13"/>
             </w:rPr>
           </w:pPr>
-          <w:hyperlink w:anchor="_Toc232507678" w:history="1">
+          <w:hyperlink w:anchor="_Toc233195742" w:history="1">
             <w:r>
               <w:rPr>
                 <w:rStyle w:val="Hipervnculo"/>
@@ -3275,7 +3029,7 @@
                 <w:sz w:val="13"/>
                 <w:szCs w:val="13"/>
               </w:rPr>
-              <w:instrText xml:space="preserve"> PAGEREF _Toc232507678 \h </w:instrText>
+              <w:instrText xml:space="preserve"> PAGEREF _Toc233195742 \h </w:instrText>
             </w:r>
             <w:r>
               <w:rPr>
@@ -3301,7 +3055,7 @@
                 <w:sz w:val="13"/>
                 <w:szCs w:val="13"/>
               </w:rPr>
-              <w:t>12</w:t>
+              <w:t>11</w:t>
             </w:r>
             <w:r>
               <w:rPr>
@@ -3326,7 +3080,7 @@
               <w:szCs w:val="13"/>
             </w:rPr>
           </w:pPr>
-          <w:hyperlink w:anchor="_Toc232507679" w:history="1">
+          <w:hyperlink w:anchor="_Toc233195743" w:history="1">
             <w:r>
               <w:rPr>
                 <w:rStyle w:val="Hipervnculo"/>
@@ -3362,7 +3116,7 @@
                 <w:sz w:val="13"/>
                 <w:szCs w:val="13"/>
               </w:rPr>
-              <w:instrText xml:space="preserve"> PAGEREF _Toc232507679 \h </w:instrText>
+              <w:instrText xml:space="preserve"> PAGEREF _Toc233195743 \h </w:instrText>
             </w:r>
             <w:r>
               <w:rPr>
@@ -3388,7 +3142,7 @@
                 <w:sz w:val="13"/>
                 <w:szCs w:val="13"/>
               </w:rPr>
-              <w:t>12</w:t>
+              <w:t>11</w:t>
             </w:r>
             <w:r>
               <w:rPr>
@@ -3404,85 +3158,52 @@
         <w:p>
           <w:pPr>
             <w:pStyle w:val="TDC1"/>
-            <w:tabs>
-              <w:tab w:val="right" w:leader="dot" w:pos="8494"/>
-            </w:tabs>
-            <w:rPr>
-              <w:noProof/>
-              <w:sz w:val="13"/>
-              <w:szCs w:val="13"/>
-            </w:rPr>
           </w:pPr>
-          <w:hyperlink w:anchor="_Toc232507680" w:history="1">
+          <w:hyperlink w:anchor="_Toc233195744" w:history="1">
             <w:r>
               <w:rPr>
                 <w:rStyle w:val="Hipervnculo"/>
-                <w:rFonts w:ascii="Arial" w:hAnsi="Arial" w:cs="Arial"/>
-                <w:noProof/>
-                <w:sz w:val="13"/>
-                <w:szCs w:val="13"/>
               </w:rPr>
               <w:t>6. Aplicación de técnicas analíticas</w:t>
             </w:r>
             <w:r>
               <w:rPr>
-                <w:noProof/>
-                <w:webHidden/>
-                <w:sz w:val="13"/>
-                <w:szCs w:val="13"/>
+                <w:webHidden/>
               </w:rPr>
               <w:tab/>
             </w:r>
             <w:r>
               <w:rPr>
-                <w:noProof/>
-                <w:webHidden/>
-                <w:sz w:val="13"/>
-                <w:szCs w:val="13"/>
+                <w:webHidden/>
               </w:rPr>
               <w:fldChar w:fldCharType="begin"/>
             </w:r>
             <w:r>
               <w:rPr>
-                <w:noProof/>
-                <w:webHidden/>
-                <w:sz w:val="13"/>
-                <w:szCs w:val="13"/>
-              </w:rPr>
-              <w:instrText xml:space="preserve"> PAGEREF _Toc232507680 \h </w:instrText>
-            </w:r>
-            <w:r>
-              <w:rPr>
-                <w:noProof/>
-                <w:webHidden/>
-                <w:sz w:val="13"/>
-                <w:szCs w:val="13"/>
-              </w:rPr>
-            </w:r>
-            <w:r>
-              <w:rPr>
-                <w:noProof/>
-                <w:webHidden/>
-                <w:sz w:val="13"/>
-                <w:szCs w:val="13"/>
+                <w:webHidden/>
+              </w:rPr>
+              <w:instrText xml:space="preserve"> PAGEREF _Toc233195744 \h </w:instrText>
+            </w:r>
+            <w:r>
+              <w:rPr>
+                <w:webHidden/>
+              </w:rPr>
+            </w:r>
+            <w:r>
+              <w:rPr>
+                <w:webHidden/>
               </w:rPr>
               <w:fldChar w:fldCharType="separate"/>
             </w:r>
             <w:r>
               <w:rPr>
-                <w:noProof/>
-                <w:webHidden/>
-                <w:sz w:val="13"/>
-                <w:szCs w:val="13"/>
-              </w:rPr>
-              <w:t>13</w:t>
-            </w:r>
-            <w:r>
-              <w:rPr>
-                <w:noProof/>
-                <w:webHidden/>
-                <w:sz w:val="13"/>
-                <w:szCs w:val="13"/>
+                <w:webHidden/>
+              </w:rPr>
+              <w:t>12</w:t>
+            </w:r>
+            <w:r>
+              <w:rPr>
+                <w:webHidden/>
               </w:rPr>
               <w:fldChar w:fldCharType="end"/>
             </w:r>
@@ -3500,7 +3221,7 @@
               <w:szCs w:val="13"/>
             </w:rPr>
           </w:pPr>
-          <w:hyperlink w:anchor="_Toc232507681" w:history="1">
+          <w:hyperlink w:anchor="_Toc233195745" w:history="1">
             <w:r>
               <w:rPr>
                 <w:rStyle w:val="Hipervnculo"/>
@@ -3536,7 +3257,7 @@
                 <w:sz w:val="13"/>
                 <w:szCs w:val="13"/>
               </w:rPr>
-              <w:instrText xml:space="preserve"> PAGEREF _Toc232507681 \h </w:instrText>
+              <w:instrText xml:space="preserve"> PAGEREF _Toc233195745 \h </w:instrText>
             </w:r>
             <w:r>
               <w:rPr>
@@ -3562,7 +3283,7 @@
                 <w:sz w:val="13"/>
                 <w:szCs w:val="13"/>
               </w:rPr>
-              <w:t>13</w:t>
+              <w:t>12</w:t>
             </w:r>
             <w:r>
               <w:rPr>
@@ -3587,7 +3308,7 @@
               <w:szCs w:val="13"/>
             </w:rPr>
           </w:pPr>
-          <w:hyperlink w:anchor="_Toc232507682" w:history="1">
+          <w:hyperlink w:anchor="_Toc233195746" w:history="1">
             <w:r>
               <w:rPr>
                 <w:rStyle w:val="Hipervnculo"/>
@@ -3623,7 +3344,7 @@
                 <w:sz w:val="13"/>
                 <w:szCs w:val="13"/>
               </w:rPr>
-              <w:instrText xml:space="preserve"> PAGEREF _Toc232507682 \h </w:instrText>
+              <w:instrText xml:space="preserve"> PAGEREF _Toc233195746 \h </w:instrText>
             </w:r>
             <w:r>
               <w:rPr>
@@ -3649,7 +3370,7 @@
                 <w:sz w:val="13"/>
                 <w:szCs w:val="13"/>
               </w:rPr>
-              <w:t>15</w:t>
+              <w:t>14</w:t>
             </w:r>
             <w:r>
               <w:rPr>
@@ -3674,7 +3395,7 @@
               <w:szCs w:val="13"/>
             </w:rPr>
           </w:pPr>
-          <w:hyperlink w:anchor="_Toc232507683" w:history="1">
+          <w:hyperlink w:anchor="_Toc233195747" w:history="1">
             <w:r>
               <w:rPr>
                 <w:rStyle w:val="Hipervnculo"/>
@@ -3710,7 +3431,7 @@
                 <w:sz w:val="13"/>
                 <w:szCs w:val="13"/>
               </w:rPr>
-              <w:instrText xml:space="preserve"> PAGEREF _Toc232507683 \h </w:instrText>
+              <w:instrText xml:space="preserve"> PAGEREF _Toc233195747 \h </w:instrText>
             </w:r>
             <w:r>
               <w:rPr>
@@ -3736,7 +3457,7 @@
                 <w:sz w:val="13"/>
                 <w:szCs w:val="13"/>
               </w:rPr>
-              <w:t>16</w:t>
+              <w:t>15</w:t>
             </w:r>
             <w:r>
               <w:rPr>
@@ -3752,85 +3473,52 @@
         <w:p>
           <w:pPr>
             <w:pStyle w:val="TDC1"/>
-            <w:tabs>
-              <w:tab w:val="right" w:leader="dot" w:pos="8494"/>
-            </w:tabs>
-            <w:rPr>
-              <w:noProof/>
-              <w:sz w:val="13"/>
-              <w:szCs w:val="13"/>
-            </w:rPr>
           </w:pPr>
-          <w:hyperlink w:anchor="_Toc232507684" w:history="1">
+          <w:hyperlink w:anchor="_Toc233195748" w:history="1">
             <w:r>
               <w:rPr>
                 <w:rStyle w:val="Hipervnculo"/>
-                <w:rFonts w:ascii="Arial" w:hAnsi="Arial" w:cs="Arial"/>
-                <w:noProof/>
-                <w:sz w:val="13"/>
-                <w:szCs w:val="13"/>
               </w:rPr>
               <w:t>7. Simulación del equipo</w:t>
             </w:r>
             <w:r>
               <w:rPr>
-                <w:noProof/>
-                <w:webHidden/>
-                <w:sz w:val="13"/>
-                <w:szCs w:val="13"/>
+                <w:webHidden/>
               </w:rPr>
               <w:tab/>
             </w:r>
             <w:r>
               <w:rPr>
-                <w:noProof/>
-                <w:webHidden/>
-                <w:sz w:val="13"/>
-                <w:szCs w:val="13"/>
+                <w:webHidden/>
               </w:rPr>
               <w:fldChar w:fldCharType="begin"/>
             </w:r>
             <w:r>
               <w:rPr>
-                <w:noProof/>
-                <w:webHidden/>
-                <w:sz w:val="13"/>
-                <w:szCs w:val="13"/>
-              </w:rPr>
-              <w:instrText xml:space="preserve"> PAGEREF _Toc232507684 \h </w:instrText>
-            </w:r>
-            <w:r>
-              <w:rPr>
-                <w:noProof/>
-                <w:webHidden/>
-                <w:sz w:val="13"/>
-                <w:szCs w:val="13"/>
-              </w:rPr>
-            </w:r>
-            <w:r>
-              <w:rPr>
-                <w:noProof/>
-                <w:webHidden/>
-                <w:sz w:val="13"/>
-                <w:szCs w:val="13"/>
+                <w:webHidden/>
+              </w:rPr>
+              <w:instrText xml:space="preserve"> PAGEREF _Toc233195748 \h </w:instrText>
+            </w:r>
+            <w:r>
+              <w:rPr>
+                <w:webHidden/>
+              </w:rPr>
+            </w:r>
+            <w:r>
+              <w:rPr>
+                <w:webHidden/>
               </w:rPr>
               <w:fldChar w:fldCharType="separate"/>
             </w:r>
             <w:r>
               <w:rPr>
-                <w:noProof/>
-                <w:webHidden/>
-                <w:sz w:val="13"/>
-                <w:szCs w:val="13"/>
-              </w:rPr>
-              <w:t>17</w:t>
-            </w:r>
-            <w:r>
-              <w:rPr>
-                <w:noProof/>
-                <w:webHidden/>
-                <w:sz w:val="13"/>
-                <w:szCs w:val="13"/>
+                <w:webHidden/>
+              </w:rPr>
+              <w:t>16</w:t>
+            </w:r>
+            <w:r>
+              <w:rPr>
+                <w:webHidden/>
               </w:rPr>
               <w:fldChar w:fldCharType="end"/>
             </w:r>
@@ -3848,7 +3536,7 @@
               <w:szCs w:val="13"/>
             </w:rPr>
           </w:pPr>
-          <w:hyperlink w:anchor="_Toc232507685" w:history="1">
+          <w:hyperlink w:anchor="_Toc233195749" w:history="1">
             <w:r>
               <w:rPr>
                 <w:rStyle w:val="Hipervnculo"/>
@@ -3883,7 +3571,7 @@
                 <w:sz w:val="13"/>
                 <w:szCs w:val="13"/>
               </w:rPr>
-              <w:instrText xml:space="preserve"> PAGEREF _Toc232507685 \h </w:instrText>
+              <w:instrText xml:space="preserve"> PAGEREF _Toc233195749 \h </w:instrText>
             </w:r>
             <w:r>
               <w:rPr>
@@ -3909,7 +3597,7 @@
                 <w:sz w:val="13"/>
                 <w:szCs w:val="13"/>
               </w:rPr>
-              <w:t>17</w:t>
+              <w:t>16</w:t>
             </w:r>
             <w:r>
               <w:rPr>
@@ -3934,7 +3622,7 @@
               <w:szCs w:val="13"/>
             </w:rPr>
           </w:pPr>
-          <w:hyperlink w:anchor="_Toc232507686" w:history="1">
+          <w:hyperlink w:anchor="_Toc233195750" w:history="1">
             <w:r>
               <w:rPr>
                 <w:rStyle w:val="Hipervnculo"/>
@@ -3969,7 +3657,7 @@
                 <w:sz w:val="13"/>
                 <w:szCs w:val="13"/>
               </w:rPr>
-              <w:instrText xml:space="preserve"> PAGEREF _Toc232507686 \h </w:instrText>
+              <w:instrText xml:space="preserve"> PAGEREF _Toc233195750 \h </w:instrText>
             </w:r>
             <w:r>
               <w:rPr>
@@ -3995,7 +3683,7 @@
                 <w:sz w:val="13"/>
                 <w:szCs w:val="13"/>
               </w:rPr>
-              <w:t>17</w:t>
+              <w:t>16</w:t>
             </w:r>
             <w:r>
               <w:rPr>
@@ -4020,7 +3708,7 @@
               <w:szCs w:val="13"/>
             </w:rPr>
           </w:pPr>
-          <w:hyperlink w:anchor="_Toc232507687" w:history="1">
+          <w:hyperlink w:anchor="_Toc233195751" w:history="1">
             <w:r>
               <w:rPr>
                 <w:rStyle w:val="Hipervnculo"/>
@@ -4055,7 +3743,7 @@
                 <w:sz w:val="13"/>
                 <w:szCs w:val="13"/>
               </w:rPr>
-              <w:instrText xml:space="preserve"> PAGEREF _Toc232507687 \h </w:instrText>
+              <w:instrText xml:space="preserve"> PAGEREF _Toc233195751 \h </w:instrText>
             </w:r>
             <w:r>
               <w:rPr>
@@ -4081,7 +3769,7 @@
                 <w:sz w:val="13"/>
                 <w:szCs w:val="13"/>
               </w:rPr>
-              <w:t>18</w:t>
+              <w:t>17</w:t>
             </w:r>
             <w:r>
               <w:rPr>
@@ -4097,85 +3785,52 @@
         <w:p>
           <w:pPr>
             <w:pStyle w:val="TDC1"/>
-            <w:tabs>
-              <w:tab w:val="right" w:leader="dot" w:pos="8494"/>
-            </w:tabs>
-            <w:rPr>
-              <w:noProof/>
-              <w:sz w:val="13"/>
-              <w:szCs w:val="13"/>
-            </w:rPr>
           </w:pPr>
-          <w:hyperlink w:anchor="_Toc232507688" w:history="1">
+          <w:hyperlink w:anchor="_Toc233195752" w:history="1">
             <w:r>
               <w:rPr>
                 <w:rStyle w:val="Hipervnculo"/>
-                <w:rFonts w:ascii="Arial" w:hAnsi="Arial" w:cs="Arial"/>
-                <w:noProof/>
-                <w:sz w:val="13"/>
-                <w:szCs w:val="13"/>
               </w:rPr>
               <w:t>8. Conclusiones y recomendaciones</w:t>
             </w:r>
             <w:r>
               <w:rPr>
-                <w:noProof/>
-                <w:webHidden/>
-                <w:sz w:val="13"/>
-                <w:szCs w:val="13"/>
+                <w:webHidden/>
               </w:rPr>
               <w:tab/>
             </w:r>
             <w:r>
               <w:rPr>
-                <w:noProof/>
-                <w:webHidden/>
-                <w:sz w:val="13"/>
-                <w:szCs w:val="13"/>
+                <w:webHidden/>
               </w:rPr>
               <w:fldChar w:fldCharType="begin"/>
             </w:r>
             <w:r>
               <w:rPr>
-                <w:noProof/>
-                <w:webHidden/>
-                <w:sz w:val="13"/>
-                <w:szCs w:val="13"/>
-              </w:rPr>
-              <w:instrText xml:space="preserve"> PAGEREF _Toc232507688 \h </w:instrText>
-            </w:r>
-            <w:r>
-              <w:rPr>
-                <w:noProof/>
-                <w:webHidden/>
-                <w:sz w:val="13"/>
-                <w:szCs w:val="13"/>
-              </w:rPr>
-            </w:r>
-            <w:r>
-              <w:rPr>
-                <w:noProof/>
-                <w:webHidden/>
-                <w:sz w:val="13"/>
-                <w:szCs w:val="13"/>
+                <w:webHidden/>
+              </w:rPr>
+              <w:instrText xml:space="preserve"> PAGEREF _Toc233195752 \h </w:instrText>
+            </w:r>
+            <w:r>
+              <w:rPr>
+                <w:webHidden/>
+              </w:rPr>
+            </w:r>
+            <w:r>
+              <w:rPr>
+                <w:webHidden/>
               </w:rPr>
               <w:fldChar w:fldCharType="separate"/>
             </w:r>
             <w:r>
               <w:rPr>
-                <w:noProof/>
-                <w:webHidden/>
-                <w:sz w:val="13"/>
-                <w:szCs w:val="13"/>
-              </w:rPr>
-              <w:t>19</w:t>
-            </w:r>
-            <w:r>
-              <w:rPr>
-                <w:noProof/>
-                <w:webHidden/>
-                <w:sz w:val="13"/>
-                <w:szCs w:val="13"/>
+                <w:webHidden/>
+              </w:rPr>
+              <w:t>18</w:t>
+            </w:r>
+            <w:r>
+              <w:rPr>
+                <w:webHidden/>
               </w:rPr>
               <w:fldChar w:fldCharType="end"/>
             </w:r>
@@ -4202,7 +3857,7 @@
           <w:rFonts w:ascii="Arial" w:hAnsi="Arial" w:cs="Arial"/>
         </w:rPr>
       </w:pPr>
-      <w:bookmarkStart w:id="1" w:name="_Toc232507644"/>
+      <w:bookmarkStart w:id="1" w:name="_Toc233195708"/>
       <w:r>
         <w:rPr>
           <w:rFonts w:ascii="Arial" w:hAnsi="Arial" w:cs="Arial"/>
@@ -4633,7 +4288,7 @@
         </w:rPr>
       </w:pPr>
       <w:bookmarkStart w:id="2" w:name="_Toc232420580"/>
-      <w:bookmarkStart w:id="3" w:name="_Toc232507645"/>
+      <w:bookmarkStart w:id="3" w:name="_Toc233195709"/>
       <w:r>
         <w:rPr>
           <w:rFonts w:ascii="Arial" w:hAnsi="Arial" w:cs="Arial"/>
@@ -4658,7 +4313,7 @@
         </w:rPr>
       </w:pPr>
       <w:bookmarkStart w:id="4" w:name="_Toc232420581"/>
-      <w:bookmarkStart w:id="5" w:name="_Toc232507646"/>
+      <w:bookmarkStart w:id="5" w:name="_Toc233195710"/>
       <w:r>
         <w:rPr>
           <w:rFonts w:ascii="Arial" w:hAnsi="Arial" w:cs="Arial"/>
@@ -4784,7 +4439,7 @@
         </w:rPr>
       </w:pPr>
       <w:bookmarkStart w:id="6" w:name="_Toc232420582"/>
-      <w:bookmarkStart w:id="7" w:name="_Toc232507647"/>
+      <w:bookmarkStart w:id="7" w:name="_Toc233195711"/>
       <w:r>
         <w:rPr>
           <w:rFonts w:ascii="Arial" w:hAnsi="Arial" w:cs="Arial"/>
@@ -4823,7 +4478,7 @@
         </w:rPr>
       </w:pPr>
       <w:bookmarkStart w:id="8" w:name="_Toc232420583"/>
-      <w:bookmarkStart w:id="9" w:name="_Toc232507648"/>
+      <w:bookmarkStart w:id="9" w:name="_Toc233195712"/>
       <w:r>
         <w:rPr>
           <w:rFonts w:ascii="Arial" w:hAnsi="Arial" w:cs="Arial"/>
@@ -4910,7 +4565,7 @@
         </w:rPr>
       </w:pPr>
       <w:bookmarkStart w:id="10" w:name="_Toc232420584"/>
-      <w:bookmarkStart w:id="11" w:name="_Toc232507649"/>
+      <w:bookmarkStart w:id="11" w:name="_Toc233195713"/>
       <w:r>
         <w:rPr>
           <w:rFonts w:ascii="Arial" w:hAnsi="Arial" w:cs="Arial"/>
@@ -5015,7 +4670,7 @@
         </w:rPr>
       </w:pPr>
       <w:bookmarkStart w:id="12" w:name="_Toc232420585"/>
-      <w:bookmarkStart w:id="13" w:name="_Toc232507650"/>
+      <w:bookmarkStart w:id="13" w:name="_Toc233195714"/>
       <w:r>
         <w:rPr>
           <w:rFonts w:ascii="Arial" w:hAnsi="Arial" w:cs="Arial"/>
@@ -5041,7 +4696,7 @@
         </w:rPr>
       </w:pPr>
       <w:bookmarkStart w:id="14" w:name="_Toc232420586"/>
-      <w:bookmarkStart w:id="15" w:name="_Toc232507651"/>
+      <w:bookmarkStart w:id="15" w:name="_Toc233195715"/>
       <w:r>
         <w:rPr>
           <w:rFonts w:ascii="Arial" w:hAnsi="Arial" w:cs="Arial"/>
@@ -5112,7 +4767,7 @@
         </w:rPr>
       </w:pPr>
       <w:bookmarkStart w:id="16" w:name="_Toc232420587"/>
-      <w:bookmarkStart w:id="17" w:name="_Toc232507652"/>
+      <w:bookmarkStart w:id="17" w:name="_Toc233195716"/>
       <w:r>
         <w:rPr>
           <w:rFonts w:ascii="Arial" w:hAnsi="Arial" w:cs="Arial"/>
@@ -5178,7 +4833,7 @@
         </w:rPr>
       </w:pPr>
       <w:bookmarkStart w:id="18" w:name="_Toc232420588"/>
-      <w:bookmarkStart w:id="19" w:name="_Toc232507653"/>
+      <w:bookmarkStart w:id="19" w:name="_Toc233195717"/>
       <w:r>
         <w:rPr>
           <w:rFonts w:ascii="Arial" w:hAnsi="Arial" w:cs="Arial"/>
@@ -5340,7 +4995,7 @@
         </w:rPr>
       </w:pPr>
       <w:bookmarkStart w:id="20" w:name="_Toc232420589"/>
-      <w:bookmarkStart w:id="21" w:name="_Toc232507654"/>
+      <w:bookmarkStart w:id="21" w:name="_Toc233195718"/>
       <w:r>
         <w:rPr>
           <w:rFonts w:ascii="Arial" w:hAnsi="Arial" w:cs="Arial"/>
@@ -5365,7 +5020,7 @@
         </w:rPr>
       </w:pPr>
       <w:bookmarkStart w:id="22" w:name="_Toc232420590"/>
-      <w:bookmarkStart w:id="23" w:name="_Toc232507655"/>
+      <w:bookmarkStart w:id="23" w:name="_Toc233195719"/>
       <w:r>
         <w:rPr>
           <w:rFonts w:ascii="Arial" w:hAnsi="Arial" w:cs="Arial"/>
@@ -5425,7 +5080,7 @@
         </w:rPr>
       </w:pPr>
       <w:bookmarkStart w:id="24" w:name="_Toc232420591"/>
-      <w:bookmarkStart w:id="25" w:name="_Toc232507656"/>
+      <w:bookmarkStart w:id="25" w:name="_Toc233195720"/>
       <w:r>
         <w:rPr>
           <w:rFonts w:ascii="Arial" w:hAnsi="Arial" w:cs="Arial"/>
@@ -5489,7 +5144,7 @@
         </w:rPr>
       </w:pPr>
       <w:bookmarkStart w:id="26" w:name="_Toc232420592"/>
-      <w:bookmarkStart w:id="27" w:name="_Toc232507657"/>
+      <w:bookmarkStart w:id="27" w:name="_Toc233195721"/>
       <w:r>
         <w:rPr>
           <w:rFonts w:ascii="Arial" w:hAnsi="Arial" w:cs="Arial"/>
@@ -5805,7 +5460,7 @@
         </w:rPr>
       </w:pPr>
       <w:bookmarkStart w:id="28" w:name="_Toc232420593"/>
-      <w:bookmarkStart w:id="29" w:name="_Toc232507658"/>
+      <w:bookmarkStart w:id="29" w:name="_Toc233195722"/>
       <w:r>
         <w:rPr>
           <w:rFonts w:ascii="Arial" w:hAnsi="Arial" w:cs="Arial"/>
@@ -5830,7 +5485,7 @@
         </w:rPr>
       </w:pPr>
       <w:bookmarkStart w:id="30" w:name="_Toc232420594"/>
-      <w:bookmarkStart w:id="31" w:name="_Toc232507659"/>
+      <w:bookmarkStart w:id="31" w:name="_Toc233195723"/>
       <w:r>
         <w:rPr>
           <w:rFonts w:ascii="Arial" w:hAnsi="Arial" w:cs="Arial"/>
@@ -5914,7 +5569,7 @@
         </w:rPr>
       </w:pPr>
       <w:bookmarkStart w:id="32" w:name="_Toc232420595"/>
-      <w:bookmarkStart w:id="33" w:name="_Toc232507660"/>
+      <w:bookmarkStart w:id="33" w:name="_Toc233195724"/>
       <w:r>
         <w:rPr>
           <w:rFonts w:ascii="Arial" w:hAnsi="Arial" w:cs="Arial"/>
@@ -6409,7 +6064,7 @@
         </w:rPr>
       </w:pPr>
       <w:bookmarkStart w:id="34" w:name="_Toc232420596"/>
-      <w:bookmarkStart w:id="35" w:name="_Toc232507661"/>
+      <w:bookmarkStart w:id="35" w:name="_Toc233195725"/>
       <w:r>
         <w:rPr>
           <w:rFonts w:ascii="Arial" w:hAnsi="Arial" w:cs="Arial"/>
@@ -6583,7 +6238,7 @@
         </w:rPr>
       </w:pPr>
       <w:bookmarkStart w:id="36" w:name="_Toc232420597"/>
-      <w:bookmarkStart w:id="37" w:name="_Toc232507662"/>
+      <w:bookmarkStart w:id="37" w:name="_Toc233195726"/>
       <w:r>
         <w:rPr>
           <w:rFonts w:ascii="Arial" w:hAnsi="Arial" w:cs="Arial"/>
@@ -6609,7 +6264,7 @@
         </w:rPr>
       </w:pPr>
       <w:bookmarkStart w:id="38" w:name="_Toc232420598"/>
-      <w:bookmarkStart w:id="39" w:name="_Toc232507663"/>
+      <w:bookmarkStart w:id="39" w:name="_Toc233195727"/>
       <w:r>
         <w:rPr>
           <w:rFonts w:ascii="Arial" w:hAnsi="Arial" w:cs="Arial"/>
@@ -6697,7 +6352,7 @@
         </w:rPr>
       </w:pPr>
       <w:bookmarkStart w:id="40" w:name="_Toc232420599"/>
-      <w:bookmarkStart w:id="41" w:name="_Toc232507664"/>
+      <w:bookmarkStart w:id="41" w:name="_Toc233195728"/>
       <w:r>
         <w:rPr>
           <w:rFonts w:ascii="Arial" w:hAnsi="Arial" w:cs="Arial"/>
@@ -6715,7 +6370,7 @@
         </w:rPr>
       </w:pPr>
       <w:bookmarkStart w:id="42" w:name="_Toc232420600"/>
-      <w:bookmarkStart w:id="43" w:name="_Toc232507665"/>
+      <w:bookmarkStart w:id="43" w:name="_Toc233195729"/>
       <w:r>
         <w:rPr>
           <w:rFonts w:ascii="Arial" w:hAnsi="Arial" w:cs="Arial"/>
@@ -6796,7 +6451,7 @@
         </w:rPr>
       </w:pPr>
       <w:bookmarkStart w:id="44" w:name="_Toc232420601"/>
-      <w:bookmarkStart w:id="45" w:name="_Toc232507666"/>
+      <w:bookmarkStart w:id="45" w:name="_Toc233195730"/>
       <w:r>
         <w:rPr>
           <w:rFonts w:ascii="Arial" w:hAnsi="Arial" w:cs="Arial"/>
@@ -6941,7 +6596,7 @@
         </w:rPr>
       </w:pPr>
       <w:bookmarkStart w:id="46" w:name="_Toc232420602"/>
-      <w:bookmarkStart w:id="47" w:name="_Toc232507667"/>
+      <w:bookmarkStart w:id="47" w:name="_Toc233195731"/>
       <w:r>
         <w:rPr>
           <w:rFonts w:ascii="Arial" w:hAnsi="Arial" w:cs="Arial"/>
@@ -7021,7 +6676,7 @@
         </w:rPr>
       </w:pPr>
       <w:bookmarkStart w:id="48" w:name="_Toc232420603"/>
-      <w:bookmarkStart w:id="49" w:name="_Toc232507668"/>
+      <w:bookmarkStart w:id="49" w:name="_Toc233195732"/>
       <w:r>
         <w:rPr>
           <w:rFonts w:ascii="Arial" w:hAnsi="Arial" w:cs="Arial"/>
@@ -7169,7 +6824,7 @@
         </w:rPr>
       </w:pPr>
       <w:bookmarkStart w:id="50" w:name="_Toc232420604"/>
-      <w:bookmarkStart w:id="51" w:name="_Toc232507669"/>
+      <w:bookmarkStart w:id="51" w:name="_Toc233195733"/>
       <w:r>
         <w:rPr>
           <w:rFonts w:ascii="Arial" w:hAnsi="Arial" w:cs="Arial"/>
@@ -7250,7 +6905,7 @@
         </w:rPr>
       </w:pPr>
       <w:bookmarkStart w:id="52" w:name="_Toc232420605"/>
-      <w:bookmarkStart w:id="53" w:name="_Toc232507670"/>
+      <w:bookmarkStart w:id="53" w:name="_Toc233195734"/>
       <w:r>
         <w:rPr>
           <w:rFonts w:ascii="Arial" w:hAnsi="Arial" w:cs="Arial"/>
@@ -7377,7 +7032,7 @@
         </w:rPr>
       </w:pPr>
       <w:bookmarkStart w:id="54" w:name="_Toc232420606"/>
-      <w:bookmarkStart w:id="55" w:name="_Toc232507671"/>
+      <w:bookmarkStart w:id="55" w:name="_Toc233195735"/>
       <w:r>
         <w:rPr>
           <w:rFonts w:ascii="Arial" w:hAnsi="Arial" w:cs="Arial"/>
@@ -7493,7 +7148,7 @@
         </w:rPr>
       </w:pPr>
       <w:bookmarkStart w:id="56" w:name="_Toc232420607"/>
-      <w:bookmarkStart w:id="57" w:name="_Toc232507672"/>
+      <w:bookmarkStart w:id="57" w:name="_Toc233195736"/>
       <w:r>
         <w:rPr>
           <w:rFonts w:ascii="Arial" w:hAnsi="Arial" w:cs="Arial"/>
@@ -7546,7 +7201,7 @@
         </w:rPr>
       </w:pPr>
       <w:bookmarkStart w:id="58" w:name="_Toc232420608"/>
-      <w:bookmarkStart w:id="59" w:name="_Toc232507673"/>
+      <w:bookmarkStart w:id="59" w:name="_Toc233195737"/>
       <w:r>
         <w:rPr>
           <w:rFonts w:ascii="Arial" w:hAnsi="Arial" w:cs="Arial"/>
@@ -7615,7 +7270,7 @@
         </w:rPr>
       </w:pPr>
       <w:bookmarkStart w:id="60" w:name="_Toc232420609"/>
-      <w:bookmarkStart w:id="61" w:name="_Toc232507674"/>
+      <w:bookmarkStart w:id="61" w:name="_Toc233195738"/>
       <w:r>
         <w:rPr>
           <w:rFonts w:ascii="Arial" w:hAnsi="Arial" w:cs="Arial"/>
@@ -7777,17 +7432,58 @@
     </w:p>
     <w:p>
       <w:pPr>
+        <w:jc w:val="both"/>
+        <w:rPr>
+          <w:rFonts w:ascii="Arial" w:hAnsi="Arial" w:cs="Arial"/>
+          <w:sz w:val="20"/>
+          <w:szCs w:val="20"/>
+        </w:rPr>
+      </w:pPr>
+    </w:p>
+    <w:p>
+      <w:pPr>
+        <w:jc w:val="both"/>
+        <w:rPr>
+          <w:rFonts w:ascii="Arial" w:hAnsi="Arial" w:cs="Arial"/>
+          <w:sz w:val="20"/>
+          <w:szCs w:val="20"/>
+        </w:rPr>
+      </w:pPr>
+    </w:p>
+    <w:p>
+      <w:pPr>
+        <w:jc w:val="both"/>
+        <w:rPr>
+          <w:rFonts w:ascii="Arial" w:hAnsi="Arial" w:cs="Arial"/>
+          <w:sz w:val="20"/>
+          <w:szCs w:val="20"/>
+        </w:rPr>
+      </w:pPr>
+    </w:p>
+    <w:p>
+      <w:pPr>
+        <w:jc w:val="both"/>
+        <w:rPr>
+          <w:rFonts w:ascii="Arial" w:hAnsi="Arial" w:cs="Arial"/>
+          <w:sz w:val="20"/>
+          <w:szCs w:val="20"/>
+        </w:rPr>
+      </w:pPr>
+    </w:p>
+    <w:p>
+      <w:pPr>
         <w:pStyle w:val="Ttulo3"/>
         <w:rPr>
           <w:rFonts w:ascii="Arial" w:hAnsi="Arial" w:cs="Arial"/>
         </w:rPr>
       </w:pPr>
       <w:bookmarkStart w:id="62" w:name="_Toc232420610"/>
-      <w:bookmarkStart w:id="63" w:name="_Toc232507675"/>
-      <w:r>
-        <w:rPr>
-          <w:rFonts w:ascii="Arial" w:hAnsi="Arial" w:cs="Arial"/>
-        </w:rPr>
+      <w:bookmarkStart w:id="63" w:name="_Toc233195739"/>
+      <w:r>
+        <w:rPr>
+          <w:rFonts w:ascii="Arial" w:hAnsi="Arial" w:cs="Arial"/>
+        </w:rPr>
+        <w:lastRenderedPageBreak/>
         <w:t>6.4.3 Gráficos explicativos III</w:t>
       </w:r>
       <w:bookmarkEnd w:id="62"/>
@@ -7819,7 +7515,6 @@
           <w:bCs/>
           <w:noProof/>
         </w:rPr>
-        <w:lastRenderedPageBreak/>
         <w:drawing>
           <wp:inline distT="0" distB="0" distL="0" distR="0" wp14:anchorId="48251624" wp14:editId="51CF4D53">
             <wp:extent cx="5400040" cy="2676059"/>
@@ -7931,32 +7626,6 @@
         <w:jc w:val="both"/>
         <w:rPr>
           <w:rFonts w:ascii="Arial" w:hAnsi="Arial" w:cs="Arial"/>
-          <w:b/>
-          <w:bCs/>
-        </w:rPr>
-      </w:pPr>
-    </w:p>
-    <w:p>
-      <w:pPr>
-        <w:jc w:val="both"/>
-        <w:rPr>
-          <w:rFonts w:ascii="Arial" w:hAnsi="Arial" w:cs="Arial"/>
-        </w:rPr>
-      </w:pPr>
-    </w:p>
-    <w:p>
-      <w:pPr>
-        <w:jc w:val="both"/>
-        <w:rPr>
-          <w:rFonts w:ascii="Arial" w:hAnsi="Arial" w:cs="Arial"/>
-        </w:rPr>
-      </w:pPr>
-    </w:p>
-    <w:p>
-      <w:pPr>
-        <w:jc w:val="both"/>
-        <w:rPr>
-          <w:rFonts w:ascii="Arial" w:hAnsi="Arial" w:cs="Arial"/>
         </w:rPr>
       </w:pPr>
     </w:p>
@@ -7968,7 +7637,7 @@
         </w:rPr>
       </w:pPr>
       <w:bookmarkStart w:id="64" w:name="_Toc232420611"/>
-      <w:bookmarkStart w:id="65" w:name="_Toc232507676"/>
+      <w:bookmarkStart w:id="65" w:name="_Toc233195740"/>
       <w:r>
         <w:rPr>
           <w:rFonts w:ascii="Arial" w:hAnsi="Arial" w:cs="Arial"/>
@@ -7994,7 +7663,7 @@
         </w:rPr>
       </w:pPr>
       <w:bookmarkStart w:id="66" w:name="_Toc232420612"/>
-      <w:bookmarkStart w:id="67" w:name="_Toc232507677"/>
+      <w:bookmarkStart w:id="67" w:name="_Toc233195741"/>
       <w:r>
         <w:rPr>
           <w:rFonts w:ascii="Arial" w:hAnsi="Arial" w:cs="Arial"/>
@@ -8061,47 +7730,39 @@
           <w:sz w:val="20"/>
           <w:szCs w:val="20"/>
         </w:rPr>
-        <w:t xml:space="preserve"> en la parte financiera de estos. La segunda parte centrada en los KPI y el análisis de estos jugadores por posición. Una tercera parte centrada en </w:t>
-      </w:r>
-      <w:r>
-        <w:rPr>
-          <w:rFonts w:ascii="Arial" w:hAnsi="Arial" w:cs="Arial"/>
-          <w:sz w:val="20"/>
-          <w:szCs w:val="20"/>
+        <w:t xml:space="preserve"> en la parte financiera de estos. La segunda parte centrada en los KPI y el análisis de estos jugadores por posición. Una tercera parte centrada en el análisis de estas posiciones por habilidad actual y habilidad potencial. Finalmente cierra con una </w:t>
+      </w:r>
+      <w:r>
+        <w:rPr>
+          <w:rFonts w:ascii="Arial" w:hAnsi="Arial" w:cs="Arial"/>
+          <w:sz w:val="20"/>
+          <w:szCs w:val="20"/>
+        </w:rPr>
+        <w:t>página</w:t>
+      </w:r>
+      <w:r>
+        <w:rPr>
+          <w:rFonts w:ascii="Arial" w:hAnsi="Arial" w:cs="Arial"/>
+          <w:sz w:val="20"/>
+          <w:szCs w:val="20"/>
+        </w:rPr>
+        <w:t xml:space="preserve"> centrada en el resultado y simulación del equipo elegido.</w:t>
+      </w:r>
+    </w:p>
+    <w:p>
+      <w:pPr>
+        <w:pStyle w:val="Ttulo2"/>
+        <w:rPr>
+          <w:rFonts w:ascii="Arial" w:hAnsi="Arial" w:cs="Arial"/>
+        </w:rPr>
+      </w:pPr>
+      <w:bookmarkStart w:id="68" w:name="_Toc232420613"/>
+      <w:bookmarkStart w:id="69" w:name="_Toc233195742"/>
+      <w:r>
+        <w:rPr>
+          <w:rFonts w:ascii="Arial" w:hAnsi="Arial" w:cs="Arial"/>
         </w:rPr>
         <w:lastRenderedPageBreak/>
-        <w:t xml:space="preserve">el análisis de estas posiciones por habilidad actual y habilidad potencial. Finalmente cierra con una </w:t>
-      </w:r>
-      <w:r>
-        <w:rPr>
-          <w:rFonts w:ascii="Arial" w:hAnsi="Arial" w:cs="Arial"/>
-          <w:sz w:val="20"/>
-          <w:szCs w:val="20"/>
-        </w:rPr>
-        <w:t>página</w:t>
-      </w:r>
-      <w:r>
-        <w:rPr>
-          <w:rFonts w:ascii="Arial" w:hAnsi="Arial" w:cs="Arial"/>
-          <w:sz w:val="20"/>
-          <w:szCs w:val="20"/>
-        </w:rPr>
-        <w:t xml:space="preserve"> centrada en el resultado y simulación del equipo elegido.</w:t>
-      </w:r>
-    </w:p>
-    <w:p>
-      <w:pPr>
-        <w:pStyle w:val="Ttulo2"/>
-        <w:rPr>
-          <w:rFonts w:ascii="Arial" w:hAnsi="Arial" w:cs="Arial"/>
-        </w:rPr>
-      </w:pPr>
-      <w:bookmarkStart w:id="68" w:name="_Toc232420613"/>
-      <w:bookmarkStart w:id="69" w:name="_Toc232507678"/>
-      <w:r>
-        <w:rPr>
-          <w:rFonts w:ascii="Arial" w:hAnsi="Arial" w:cs="Arial"/>
-        </w:rPr>
         <w:t>7.2 Capturas principales</w:t>
       </w:r>
       <w:bookmarkEnd w:id="68"/>
@@ -8109,7 +7770,7 @@
     </w:p>
     <w:p>
       <w:pPr>
-        <w:jc w:val="both"/>
+        <w:jc w:val="center"/>
         <w:rPr>
           <w:rFonts w:ascii="Arial" w:hAnsi="Arial" w:cs="Arial"/>
           <w:b/>
@@ -8160,7 +7821,7 @@
     </w:p>
     <w:p>
       <w:pPr>
-        <w:jc w:val="both"/>
+        <w:jc w:val="center"/>
         <w:rPr>
           <w:rFonts w:ascii="Arial" w:hAnsi="Arial" w:cs="Arial"/>
           <w:b/>
@@ -8211,7 +7872,7 @@
     </w:p>
     <w:p>
       <w:pPr>
-        <w:jc w:val="both"/>
+        <w:jc w:val="center"/>
         <w:rPr>
           <w:rFonts w:ascii="Arial" w:hAnsi="Arial" w:cs="Arial"/>
           <w:b/>
@@ -8268,7 +7929,7 @@
         </w:rPr>
       </w:pPr>
       <w:bookmarkStart w:id="70" w:name="_Toc232420614"/>
-      <w:bookmarkStart w:id="71" w:name="_Toc232507679"/>
+      <w:bookmarkStart w:id="71" w:name="_Toc233195743"/>
       <w:r>
         <w:rPr>
           <w:rFonts w:ascii="Arial" w:hAnsi="Arial" w:cs="Arial"/>
@@ -8327,34 +7988,36 @@
           <w:sz w:val="20"/>
           <w:szCs w:val="20"/>
         </w:rPr>
-        <w:t xml:space="preserve">Los KPI de posición han sido necesarios para poder estandarizar la capacidad y habilidad de cada jugador en su posición, para poder determinar sus características y clasificarlos, funcionan de la siguiente manera. Cada jugador tiene habilidades físicas y hábiles mientras que para jugar bien en cada posición requiere de tener ciertas habilidades con un valor elevado. Por lo que si </w:t>
-      </w:r>
-      <w:r>
-        <w:rPr>
-          <w:rFonts w:ascii="Arial" w:hAnsi="Arial" w:cs="Arial"/>
-          <w:sz w:val="20"/>
-          <w:szCs w:val="20"/>
+        <w:t>Los KPI de posición han sido necesarios para poder estandarizar la capacidad y habilidad de cada jugador en su posición, para poder determinar sus características y clasificarlos, funcionan de la siguiente manera. Cada jugador tiene habilidades físicas y hábiles mientras que para jugar bien en cada posición requiere de tener ciertas habilidades con un valor elevado. Por lo que si sumamos esas cifras y las dividimos por el numero de habilidades usados, obtenemos su media en esa posición.</w:t>
+      </w:r>
+    </w:p>
+    <w:p>
+      <w:pPr>
+        <w:jc w:val="both"/>
+        <w:rPr>
+          <w:rFonts w:ascii="Arial" w:hAnsi="Arial" w:cs="Arial"/>
+          <w:sz w:val="20"/>
+          <w:szCs w:val="20"/>
+        </w:rPr>
+      </w:pPr>
+    </w:p>
+    <w:p>
+      <w:pPr>
+        <w:jc w:val="both"/>
+        <w:rPr>
+          <w:rFonts w:ascii="Arial" w:hAnsi="Arial" w:cs="Arial"/>
+          <w:sz w:val="20"/>
+          <w:szCs w:val="20"/>
+        </w:rPr>
+      </w:pPr>
+      <w:r>
+        <w:rPr>
+          <w:rFonts w:ascii="Arial" w:hAnsi="Arial" w:cs="Arial"/>
+          <w:sz w:val="20"/>
+          <w:szCs w:val="20"/>
+          <w:u w:val="single"/>
         </w:rPr>
         <w:lastRenderedPageBreak/>
-        <w:t>sumamos esas cifras y las dividimos por el numero de habilidades usados, obtenemos su media en esa posición.</w:t>
-      </w:r>
-    </w:p>
-    <w:p>
-      <w:pPr>
-        <w:jc w:val="both"/>
-        <w:rPr>
-          <w:rFonts w:ascii="Arial" w:hAnsi="Arial" w:cs="Arial"/>
-          <w:sz w:val="20"/>
-          <w:szCs w:val="20"/>
-        </w:rPr>
-      </w:pPr>
-      <w:r>
-        <w:rPr>
-          <w:rFonts w:ascii="Arial" w:hAnsi="Arial" w:cs="Arial"/>
-          <w:sz w:val="20"/>
-          <w:szCs w:val="20"/>
-          <w:u w:val="single"/>
-        </w:rPr>
         <w:t>KPI de posición</w:t>
       </w:r>
       <w:r>
@@ -8639,13 +8302,25 @@
     </w:p>
     <w:p>
       <w:pPr>
+        <w:jc w:val="both"/>
+        <w:rPr>
+          <w:rFonts w:ascii="Arial" w:hAnsi="Arial" w:cs="Arial"/>
+          <w:i/>
+          <w:iCs/>
+          <w:sz w:val="20"/>
+          <w:szCs w:val="20"/>
+        </w:rPr>
+      </w:pPr>
+    </w:p>
+    <w:p>
+      <w:pPr>
         <w:pStyle w:val="Ttulo1"/>
         <w:rPr>
           <w:rFonts w:ascii="Arial" w:hAnsi="Arial" w:cs="Arial"/>
         </w:rPr>
       </w:pPr>
       <w:bookmarkStart w:id="72" w:name="_Toc232420615"/>
-      <w:bookmarkStart w:id="73" w:name="_Toc232507680"/>
+      <w:bookmarkStart w:id="73" w:name="_Toc233195744"/>
       <w:r>
         <w:rPr>
           <w:rFonts w:ascii="Arial" w:hAnsi="Arial" w:cs="Arial"/>
@@ -8664,7 +8339,7 @@
         </w:rPr>
       </w:pPr>
       <w:bookmarkStart w:id="74" w:name="_Toc232420616"/>
-      <w:bookmarkStart w:id="75" w:name="_Toc232507681"/>
+      <w:bookmarkStart w:id="75" w:name="_Toc233195745"/>
       <w:r>
         <w:rPr>
           <w:rFonts w:ascii="Arial" w:hAnsi="Arial" w:cs="Arial"/>
@@ -8707,36 +8382,6 @@
           <w:szCs w:val="20"/>
         </w:rPr>
       </w:pPr>
-    </w:p>
-    <w:p>
-      <w:pPr>
-        <w:jc w:val="both"/>
-        <w:rPr>
-          <w:rFonts w:ascii="Arial" w:hAnsi="Arial" w:cs="Arial"/>
-          <w:sz w:val="20"/>
-          <w:szCs w:val="20"/>
-        </w:rPr>
-      </w:pPr>
-    </w:p>
-    <w:p>
-      <w:pPr>
-        <w:jc w:val="both"/>
-        <w:rPr>
-          <w:rFonts w:ascii="Arial" w:hAnsi="Arial" w:cs="Arial"/>
-          <w:sz w:val="20"/>
-          <w:szCs w:val="20"/>
-        </w:rPr>
-      </w:pPr>
-    </w:p>
-    <w:p>
-      <w:pPr>
-        <w:jc w:val="both"/>
-        <w:rPr>
-          <w:rFonts w:ascii="Arial" w:hAnsi="Arial" w:cs="Arial"/>
-          <w:sz w:val="20"/>
-          <w:szCs w:val="20"/>
-        </w:rPr>
-      </w:pPr>
       <w:r>
         <w:rPr>
           <w:rFonts w:ascii="Arial" w:hAnsi="Arial" w:cs="Arial"/>
@@ -8760,7 +8405,6 @@
           <w:rFonts w:ascii="Arial" w:hAnsi="Arial" w:cs="Arial"/>
           <w:noProof/>
         </w:rPr>
-        <w:lastRenderedPageBreak/>
         <w:drawing>
           <wp:inline distT="0" distB="0" distL="0" distR="0" wp14:anchorId="4341CA71" wp14:editId="4E003CB9">
             <wp:extent cx="5400040" cy="1624965"/>
@@ -8807,12 +8451,23 @@
           <w:szCs w:val="20"/>
         </w:rPr>
       </w:pPr>
-      <w:r>
-        <w:rPr>
-          <w:rFonts w:ascii="Arial" w:hAnsi="Arial" w:cs="Arial"/>
-          <w:sz w:val="20"/>
-          <w:szCs w:val="20"/>
-        </w:rPr>
+    </w:p>
+    <w:p>
+      <w:pPr>
+        <w:jc w:val="both"/>
+        <w:rPr>
+          <w:rFonts w:ascii="Arial" w:hAnsi="Arial" w:cs="Arial"/>
+          <w:sz w:val="20"/>
+          <w:szCs w:val="20"/>
+        </w:rPr>
+      </w:pPr>
+      <w:r>
+        <w:rPr>
+          <w:rFonts w:ascii="Arial" w:hAnsi="Arial" w:cs="Arial"/>
+          <w:sz w:val="20"/>
+          <w:szCs w:val="20"/>
+        </w:rPr>
+        <w:lastRenderedPageBreak/>
         <w:t xml:space="preserve">Por lo que podemos observar en la tabla, en las posiciones de delantero, extremo y defensa, la tendencia se mantiene, cuanto mayor es su KPI, mayor es su salario. </w:t>
       </w:r>
     </w:p>
@@ -8885,6 +8540,16 @@
         </w:rPr>
         <w:t>Las variables usadas han sido su sueldo anual, su KPI de posición de forma individualizada y su posición.</w:t>
       </w:r>
+    </w:p>
+    <w:p>
+      <w:pPr>
+        <w:jc w:val="both"/>
+        <w:rPr>
+          <w:rFonts w:ascii="Arial" w:hAnsi="Arial" w:cs="Arial"/>
+          <w:sz w:val="20"/>
+          <w:szCs w:val="20"/>
+        </w:rPr>
+      </w:pPr>
     </w:p>
     <w:p>
       <w:pPr>
@@ -8958,6 +8623,12 @@
       <w:bookmarkStart w:id="76" w:name="_Toc232420617"/>
     </w:p>
     <w:p/>
+    <w:p/>
+    <w:p/>
+    <w:p/>
+    <w:p/>
+    <w:p/>
+    <w:p/>
     <w:p>
       <w:pPr>
         <w:pStyle w:val="Ttulo2"/>
@@ -8965,7 +8636,7 @@
           <w:rFonts w:ascii="Arial" w:hAnsi="Arial" w:cs="Arial"/>
         </w:rPr>
       </w:pPr>
-      <w:bookmarkStart w:id="77" w:name="_Toc232507682"/>
+      <w:bookmarkStart w:id="77" w:name="_Toc233195746"/>
       <w:r>
         <w:rPr>
           <w:rFonts w:ascii="Arial" w:hAnsi="Arial" w:cs="Arial"/>
@@ -9170,6 +8841,7 @@
       </w:pPr>
       <w:bookmarkStart w:id="78" w:name="_Toc232420618"/>
     </w:p>
+    <w:p/>
     <w:p>
       <w:pPr>
         <w:pStyle w:val="Ttulo2"/>
@@ -9177,11 +8849,12 @@
           <w:rFonts w:ascii="Arial" w:hAnsi="Arial" w:cs="Arial"/>
         </w:rPr>
       </w:pPr>
-      <w:bookmarkStart w:id="79" w:name="_Toc232507683"/>
-      <w:r>
-        <w:rPr>
-          <w:rFonts w:ascii="Arial" w:hAnsi="Arial" w:cs="Arial"/>
-        </w:rPr>
+      <w:bookmarkStart w:id="79" w:name="_Toc233195747"/>
+      <w:r>
+        <w:rPr>
+          <w:rFonts w:ascii="Arial" w:hAnsi="Arial" w:cs="Arial"/>
+        </w:rPr>
+        <w:lastRenderedPageBreak/>
         <w:t>6.2 KMEANS</w:t>
       </w:r>
       <w:bookmarkEnd w:id="78"/>
@@ -9432,13 +9105,29 @@
     </w:p>
     <w:p>
       <w:pPr>
+        <w:jc w:val="both"/>
+        <w:rPr>
+          <w:rFonts w:ascii="Arial" w:hAnsi="Arial" w:cs="Arial"/>
+        </w:rPr>
+      </w:pPr>
+    </w:p>
+    <w:p>
+      <w:pPr>
+        <w:jc w:val="both"/>
+        <w:rPr>
+          <w:rFonts w:ascii="Arial" w:hAnsi="Arial" w:cs="Arial"/>
+        </w:rPr>
+      </w:pPr>
+    </w:p>
+    <w:p>
+      <w:pPr>
         <w:pStyle w:val="Ttulo1"/>
         <w:rPr>
           <w:rFonts w:ascii="Arial" w:hAnsi="Arial" w:cs="Arial"/>
         </w:rPr>
       </w:pPr>
       <w:bookmarkStart w:id="80" w:name="_Toc232420619"/>
-      <w:bookmarkStart w:id="81" w:name="_Toc232507684"/>
+      <w:bookmarkStart w:id="81" w:name="_Toc233195748"/>
       <w:r>
         <w:rPr>
           <w:rFonts w:ascii="Arial" w:hAnsi="Arial" w:cs="Arial"/>
@@ -9460,7 +9149,7 @@
       <w:pPr>
         <w:pStyle w:val="Ttulo2"/>
       </w:pPr>
-      <w:bookmarkStart w:id="82" w:name="_Toc232507685"/>
+      <w:bookmarkStart w:id="82" w:name="_Toc233195749"/>
       <w:r>
         <w:t>7.1 Contexto</w:t>
       </w:r>
@@ -9488,7 +9177,7 @@
       <w:pPr>
         <w:pStyle w:val="Ttulo2"/>
       </w:pPr>
-      <w:bookmarkStart w:id="83" w:name="_Toc232507686"/>
+      <w:bookmarkStart w:id="83" w:name="_Toc233195750"/>
       <w:r>
         <w:t>7.2 Posición de liga</w:t>
       </w:r>
@@ -9506,7 +9195,7 @@
           <w:noProof/>
         </w:rPr>
         <w:drawing>
-          <wp:inline distT="0" distB="0" distL="0" distR="0" wp14:anchorId="011850D2" wp14:editId="760CE10B">
+          <wp:inline distT="0" distB="0" distL="0" distR="0" wp14:anchorId="011850D2" wp14:editId="598B65FF">
             <wp:extent cx="5400040" cy="3354705"/>
             <wp:effectExtent l="0" t="0" r="0" b="0"/>
             <wp:docPr id="1228574683" name="Imagen 1"/>
@@ -9692,7 +9381,7 @@
       <w:pPr>
         <w:pStyle w:val="Ttulo2"/>
       </w:pPr>
-      <w:bookmarkStart w:id="84" w:name="_Toc232507687"/>
+      <w:bookmarkStart w:id="84" w:name="_Toc233195751"/>
       <w:r>
         <w:t>7.3 Registros individuales</w:t>
       </w:r>
@@ -9710,7 +9399,7 @@
           <w:noProof/>
         </w:rPr>
         <w:drawing>
-          <wp:inline distT="0" distB="0" distL="0" distR="0" wp14:anchorId="2425EF83" wp14:editId="2EC27B9C">
+          <wp:inline distT="0" distB="0" distL="0" distR="0" wp14:anchorId="2425EF83" wp14:editId="693CB8D3">
             <wp:extent cx="5400040" cy="3059430"/>
             <wp:effectExtent l="0" t="0" r="0" b="7620"/>
             <wp:docPr id="1533460088" name="Imagen 3"/>
@@ -9803,13 +9492,21 @@
     </w:p>
     <w:p>
       <w:pPr>
+        <w:jc w:val="both"/>
+        <w:rPr>
+          <w:rFonts w:ascii="Arial" w:hAnsi="Arial" w:cs="Arial"/>
+        </w:rPr>
+      </w:pPr>
+    </w:p>
+    <w:p>
+      <w:pPr>
         <w:pStyle w:val="Ttulo1"/>
         <w:rPr>
           <w:rFonts w:ascii="Arial" w:hAnsi="Arial" w:cs="Arial"/>
         </w:rPr>
       </w:pPr>
       <w:bookmarkStart w:id="85" w:name="_Toc232420620"/>
-      <w:bookmarkStart w:id="86" w:name="_Toc232507688"/>
+      <w:bookmarkStart w:id="86" w:name="_Toc233195752"/>
       <w:r>
         <w:rPr>
           <w:rFonts w:ascii="Arial" w:hAnsi="Arial" w:cs="Arial"/>
@@ -12363,10 +12060,19 @@
     <w:autoRedefine/>
     <w:uiPriority w:val="39"/>
     <w:unhideWhenUsed/>
-    <w:rsid w:val="00444EFA"/>
+    <w:rsid w:val="005E5EBD"/>
     <w:pPr>
+      <w:tabs>
+        <w:tab w:val="right" w:leader="dot" w:pos="8494"/>
+      </w:tabs>
       <w:spacing w:after="100"/>
     </w:pPr>
+    <w:rPr>
+      <w:rFonts w:ascii="Arial" w:hAnsi="Arial" w:cs="Arial"/>
+      <w:noProof/>
+      <w:sz w:val="13"/>
+      <w:szCs w:val="13"/>
+    </w:rPr>
   </w:style>
   <w:style w:type="paragraph" w:styleId="TDC2">
     <w:name w:val="toc 2"/>

</xml_diff>